<commit_message>
Updated notes with environment variables
</commit_message>
<xml_diff>
--- a/OOPS Java.docx
+++ b/OOPS Java.docx
@@ -50,7 +50,7 @@
           <w:r>
             <w:fldChar w:fldCharType="separate"/>
           </w:r>
-          <w:hyperlink w:anchor="_Toc203364712" w:history="1">
+          <w:hyperlink w:anchor="_Toc203870343" w:history="1">
             <w:r>
               <w:rPr>
                 <w:rStyle w:val="Hyperlink"/>
@@ -75,7 +75,7 @@
                 <w:noProof/>
                 <w:lang w:eastAsia="en-GB"/>
               </w:rPr>
-              <w:t>Core OOP Principles (Pillars of OOP)</w:t>
+              <w:t>Introduction</w:t>
             </w:r>
             <w:r>
               <w:rPr>
@@ -96,7 +96,7 @@
                 <w:noProof/>
                 <w:webHidden/>
               </w:rPr>
-              <w:instrText xml:space="preserve"> PAGEREF _Toc203364712 \h </w:instrText>
+              <w:instrText xml:space="preserve"> PAGEREF _Toc203870343 \h </w:instrText>
             </w:r>
             <w:r>
               <w:rPr>
@@ -139,13 +139,14 @@
               <w:lang w:eastAsia="en-GB" w:bidi="ar-SA"/>
             </w:rPr>
           </w:pPr>
-          <w:hyperlink w:anchor="_Toc203364713" w:history="1">
+          <w:hyperlink w:anchor="_Toc203870344" w:history="1">
             <w:r>
               <w:rPr>
                 <w:rStyle w:val="Hyperlink"/>
                 <w:noProof/>
-              </w:rPr>
-              <w:t>1. Class</w:t>
+                <w:lang w:eastAsia="en-GB"/>
+              </w:rPr>
+              <w:t>Environment variables</w:t>
             </w:r>
             <w:r>
               <w:rPr>
@@ -166,7 +167,7 @@
                 <w:noProof/>
                 <w:webHidden/>
               </w:rPr>
-              <w:instrText xml:space="preserve"> PAGEREF _Toc203364713 \h </w:instrText>
+              <w:instrText xml:space="preserve"> PAGEREF _Toc203870344 \h </w:instrText>
             </w:r>
             <w:r>
               <w:rPr>
@@ -186,7 +187,7 @@
                 <w:noProof/>
                 <w:webHidden/>
               </w:rPr>
-              <w:t>4</w:t>
+              <w:t>3</w:t>
             </w:r>
             <w:r>
               <w:rPr>
@@ -209,13 +210,14 @@
               <w:lang w:eastAsia="en-GB" w:bidi="ar-SA"/>
             </w:rPr>
           </w:pPr>
-          <w:hyperlink w:anchor="_Toc203364714" w:history="1">
+          <w:hyperlink w:anchor="_Toc203870345" w:history="1">
             <w:r>
               <w:rPr>
                 <w:rStyle w:val="Hyperlink"/>
                 <w:noProof/>
-              </w:rPr>
-              <w:t>2. Object</w:t>
+                <w:lang w:eastAsia="en-GB"/>
+              </w:rPr>
+              <w:t>User Variables:</w:t>
             </w:r>
             <w:r>
               <w:rPr>
@@ -236,7 +238,7 @@
                 <w:noProof/>
                 <w:webHidden/>
               </w:rPr>
-              <w:instrText xml:space="preserve"> PAGEREF _Toc203364714 \h </w:instrText>
+              <w:instrText xml:space="preserve"> PAGEREF _Toc203870345 \h </w:instrText>
             </w:r>
             <w:r>
               <w:rPr>
@@ -256,7 +258,7 @@
                 <w:noProof/>
                 <w:webHidden/>
               </w:rPr>
-              <w:t>5</w:t>
+              <w:t>3</w:t>
             </w:r>
             <w:r>
               <w:rPr>
@@ -279,13 +281,14 @@
               <w:lang w:eastAsia="en-GB" w:bidi="ar-SA"/>
             </w:rPr>
           </w:pPr>
-          <w:hyperlink w:anchor="_Toc203364715" w:history="1">
+          <w:hyperlink w:anchor="_Toc203870346" w:history="1">
             <w:r>
               <w:rPr>
                 <w:rStyle w:val="Hyperlink"/>
                 <w:noProof/>
-              </w:rPr>
-              <w:t>3. Abstraction</w:t>
+                <w:lang w:eastAsia="en-GB"/>
+              </w:rPr>
+              <w:t>System Variables:</w:t>
             </w:r>
             <w:r>
               <w:rPr>
@@ -306,7 +309,7 @@
                 <w:noProof/>
                 <w:webHidden/>
               </w:rPr>
-              <w:instrText xml:space="preserve"> PAGEREF _Toc203364715 \h </w:instrText>
+              <w:instrText xml:space="preserve"> PAGEREF _Toc203870346 \h </w:instrText>
             </w:r>
             <w:r>
               <w:rPr>
@@ -326,7 +329,7 @@
                 <w:noProof/>
                 <w:webHidden/>
               </w:rPr>
-              <w:t>6</w:t>
+              <w:t>3</w:t>
             </w:r>
             <w:r>
               <w:rPr>
@@ -349,13 +352,14 @@
               <w:lang w:eastAsia="en-GB" w:bidi="ar-SA"/>
             </w:rPr>
           </w:pPr>
-          <w:hyperlink w:anchor="_Toc203364716" w:history="1">
+          <w:hyperlink w:anchor="_Toc203870347" w:history="1">
             <w:r>
               <w:rPr>
                 <w:rStyle w:val="Hyperlink"/>
                 <w:noProof/>
-              </w:rPr>
-              <w:t>4. Encapsulation</w:t>
+                <w:lang w:eastAsia="en-GB"/>
+              </w:rPr>
+              <w:t>Where to Set Environment Variables</w:t>
             </w:r>
             <w:r>
               <w:rPr>
@@ -376,7 +380,7 @@
                 <w:noProof/>
                 <w:webHidden/>
               </w:rPr>
-              <w:instrText xml:space="preserve"> PAGEREF _Toc203364716 \h </w:instrText>
+              <w:instrText xml:space="preserve"> PAGEREF _Toc203870347 \h </w:instrText>
             </w:r>
             <w:r>
               <w:rPr>
@@ -396,7 +400,7 @@
                 <w:noProof/>
                 <w:webHidden/>
               </w:rPr>
-              <w:t>7</w:t>
+              <w:t>3</w:t>
             </w:r>
             <w:r>
               <w:rPr>
@@ -419,13 +423,14 @@
               <w:lang w:eastAsia="en-GB" w:bidi="ar-SA"/>
             </w:rPr>
           </w:pPr>
-          <w:hyperlink w:anchor="_Toc203364717" w:history="1">
+          <w:hyperlink w:anchor="_Toc203870348" w:history="1">
             <w:r>
               <w:rPr>
                 <w:rStyle w:val="Hyperlink"/>
                 <w:noProof/>
-              </w:rPr>
-              <w:t>5. Inheritance</w:t>
+                <w:lang w:eastAsia="en-GB"/>
+              </w:rPr>
+              <w:t>Important Java Environment Variables</w:t>
             </w:r>
             <w:r>
               <w:rPr>
@@ -446,7 +451,7 @@
                 <w:noProof/>
                 <w:webHidden/>
               </w:rPr>
-              <w:instrText xml:space="preserve"> PAGEREF _Toc203364717 \h </w:instrText>
+              <w:instrText xml:space="preserve"> PAGEREF _Toc203870348 \h </w:instrText>
             </w:r>
             <w:r>
               <w:rPr>
@@ -466,7 +471,217 @@
                 <w:noProof/>
                 <w:webHidden/>
               </w:rPr>
-              <w:t>8</w:t>
+              <w:t>3</w:t>
+            </w:r>
+            <w:r>
+              <w:rPr>
+                <w:noProof/>
+                <w:webHidden/>
+              </w:rPr>
+              <w:fldChar w:fldCharType="end"/>
+            </w:r>
+          </w:hyperlink>
+        </w:p>
+        <w:p>
+          <w:pPr>
+            <w:pStyle w:val="TOC3"/>
+            <w:tabs>
+              <w:tab w:val="right" w:leader="dot" w:pos="10054"/>
+            </w:tabs>
+            <w:rPr>
+              <w:rFonts w:eastAsiaTheme="minorEastAsia"/>
+              <w:noProof/>
+              <w:lang w:eastAsia="en-GB" w:bidi="ar-SA"/>
+            </w:rPr>
+          </w:pPr>
+          <w:hyperlink w:anchor="_Toc203870349" w:history="1">
+            <w:r>
+              <w:rPr>
+                <w:rStyle w:val="Hyperlink"/>
+                <w:noProof/>
+              </w:rPr>
+              <w:t>JAVA_HOME</w:t>
+            </w:r>
+            <w:r>
+              <w:rPr>
+                <w:noProof/>
+                <w:webHidden/>
+              </w:rPr>
+              <w:tab/>
+            </w:r>
+            <w:r>
+              <w:rPr>
+                <w:noProof/>
+                <w:webHidden/>
+              </w:rPr>
+              <w:fldChar w:fldCharType="begin"/>
+            </w:r>
+            <w:r>
+              <w:rPr>
+                <w:noProof/>
+                <w:webHidden/>
+              </w:rPr>
+              <w:instrText xml:space="preserve"> PAGEREF _Toc203870349 \h </w:instrText>
+            </w:r>
+            <w:r>
+              <w:rPr>
+                <w:noProof/>
+                <w:webHidden/>
+              </w:rPr>
+            </w:r>
+            <w:r>
+              <w:rPr>
+                <w:noProof/>
+                <w:webHidden/>
+              </w:rPr>
+              <w:fldChar w:fldCharType="separate"/>
+            </w:r>
+            <w:r>
+              <w:rPr>
+                <w:noProof/>
+                <w:webHidden/>
+              </w:rPr>
+              <w:t>3</w:t>
+            </w:r>
+            <w:r>
+              <w:rPr>
+                <w:noProof/>
+                <w:webHidden/>
+              </w:rPr>
+              <w:fldChar w:fldCharType="end"/>
+            </w:r>
+          </w:hyperlink>
+        </w:p>
+        <w:p>
+          <w:pPr>
+            <w:pStyle w:val="TOC3"/>
+            <w:tabs>
+              <w:tab w:val="right" w:leader="dot" w:pos="10054"/>
+            </w:tabs>
+            <w:rPr>
+              <w:rFonts w:eastAsiaTheme="minorEastAsia"/>
+              <w:noProof/>
+              <w:lang w:eastAsia="en-GB" w:bidi="ar-SA"/>
+            </w:rPr>
+          </w:pPr>
+          <w:hyperlink w:anchor="_Toc203870350" w:history="1">
+            <w:r>
+              <w:rPr>
+                <w:rStyle w:val="Hyperlink"/>
+                <w:noProof/>
+              </w:rPr>
+              <w:t>PATH</w:t>
+            </w:r>
+            <w:r>
+              <w:rPr>
+                <w:noProof/>
+                <w:webHidden/>
+              </w:rPr>
+              <w:tab/>
+            </w:r>
+            <w:r>
+              <w:rPr>
+                <w:noProof/>
+                <w:webHidden/>
+              </w:rPr>
+              <w:fldChar w:fldCharType="begin"/>
+            </w:r>
+            <w:r>
+              <w:rPr>
+                <w:noProof/>
+                <w:webHidden/>
+              </w:rPr>
+              <w:instrText xml:space="preserve"> PAGEREF _Toc203870350 \h </w:instrText>
+            </w:r>
+            <w:r>
+              <w:rPr>
+                <w:noProof/>
+                <w:webHidden/>
+              </w:rPr>
+            </w:r>
+            <w:r>
+              <w:rPr>
+                <w:noProof/>
+                <w:webHidden/>
+              </w:rPr>
+              <w:fldChar w:fldCharType="separate"/>
+            </w:r>
+            <w:r>
+              <w:rPr>
+                <w:noProof/>
+                <w:webHidden/>
+              </w:rPr>
+              <w:t>3</w:t>
+            </w:r>
+            <w:r>
+              <w:rPr>
+                <w:noProof/>
+                <w:webHidden/>
+              </w:rPr>
+              <w:fldChar w:fldCharType="end"/>
+            </w:r>
+          </w:hyperlink>
+        </w:p>
+        <w:p>
+          <w:pPr>
+            <w:pStyle w:val="TOC3"/>
+            <w:tabs>
+              <w:tab w:val="right" w:leader="dot" w:pos="10054"/>
+            </w:tabs>
+            <w:rPr>
+              <w:rFonts w:eastAsiaTheme="minorEastAsia"/>
+              <w:noProof/>
+              <w:lang w:eastAsia="en-GB" w:bidi="ar-SA"/>
+            </w:rPr>
+          </w:pPr>
+          <w:hyperlink w:anchor="_Toc203870351" w:history="1">
+            <w:r>
+              <w:rPr>
+                <w:rStyle w:val="Hyperlink"/>
+                <w:noProof/>
+              </w:rPr>
+              <w:t>CLASSPATH</w:t>
+            </w:r>
+            <w:r>
+              <w:rPr>
+                <w:noProof/>
+                <w:webHidden/>
+              </w:rPr>
+              <w:tab/>
+            </w:r>
+            <w:r>
+              <w:rPr>
+                <w:noProof/>
+                <w:webHidden/>
+              </w:rPr>
+              <w:fldChar w:fldCharType="begin"/>
+            </w:r>
+            <w:r>
+              <w:rPr>
+                <w:noProof/>
+                <w:webHidden/>
+              </w:rPr>
+              <w:instrText xml:space="preserve"> PAGEREF _Toc203870351 \h </w:instrText>
+            </w:r>
+            <w:r>
+              <w:rPr>
+                <w:noProof/>
+                <w:webHidden/>
+              </w:rPr>
+            </w:r>
+            <w:r>
+              <w:rPr>
+                <w:noProof/>
+                <w:webHidden/>
+              </w:rPr>
+              <w:fldChar w:fldCharType="separate"/>
+            </w:r>
+            <w:r>
+              <w:rPr>
+                <w:noProof/>
+                <w:webHidden/>
+              </w:rPr>
+              <w:t>3</w:t>
             </w:r>
             <w:r>
               <w:rPr>
@@ -489,13 +704,14 @@
               <w:lang w:eastAsia="en-GB" w:bidi="ar-SA"/>
             </w:rPr>
           </w:pPr>
-          <w:hyperlink w:anchor="_Toc203364718" w:history="1">
+          <w:hyperlink w:anchor="_Toc203870352" w:history="1">
             <w:r>
               <w:rPr>
                 <w:rStyle w:val="Hyperlink"/>
                 <w:noProof/>
-              </w:rPr>
-              <w:t>6. Polymorphism</w:t>
+                <w:lang w:eastAsia="en-GB"/>
+              </w:rPr>
+              <w:t>Examples</w:t>
             </w:r>
             <w:r>
               <w:rPr>
@@ -516,7 +732,7 @@
                 <w:noProof/>
                 <w:webHidden/>
               </w:rPr>
-              <w:instrText xml:space="preserve"> PAGEREF _Toc203364718 \h </w:instrText>
+              <w:instrText xml:space="preserve"> PAGEREF _Toc203870352 \h </w:instrText>
             </w:r>
             <w:r>
               <w:rPr>
@@ -536,147 +752,7 @@
                 <w:noProof/>
                 <w:webHidden/>
               </w:rPr>
-              <w:t>9</w:t>
-            </w:r>
-            <w:r>
-              <w:rPr>
-                <w:noProof/>
-                <w:webHidden/>
-              </w:rPr>
-              <w:fldChar w:fldCharType="end"/>
-            </w:r>
-          </w:hyperlink>
-        </w:p>
-        <w:p>
-          <w:pPr>
-            <w:pStyle w:val="TOC3"/>
-            <w:tabs>
-              <w:tab w:val="right" w:leader="dot" w:pos="10054"/>
-            </w:tabs>
-            <w:rPr>
-              <w:rFonts w:eastAsiaTheme="minorEastAsia"/>
-              <w:noProof/>
-              <w:lang w:eastAsia="en-GB" w:bidi="ar-SA"/>
-            </w:rPr>
-          </w:pPr>
-          <w:hyperlink w:anchor="_Toc203364719" w:history="1">
-            <w:r>
-              <w:rPr>
-                <w:rStyle w:val="Hyperlink"/>
-                <w:noProof/>
-              </w:rPr>
-              <w:t>Compile-time Polymorphism (Method Overloading)</w:t>
-            </w:r>
-            <w:r>
-              <w:rPr>
-                <w:noProof/>
-                <w:webHidden/>
-              </w:rPr>
-              <w:tab/>
-            </w:r>
-            <w:r>
-              <w:rPr>
-                <w:noProof/>
-                <w:webHidden/>
-              </w:rPr>
-              <w:fldChar w:fldCharType="begin"/>
-            </w:r>
-            <w:r>
-              <w:rPr>
-                <w:noProof/>
-                <w:webHidden/>
-              </w:rPr>
-              <w:instrText xml:space="preserve"> PAGEREF _Toc203364719 \h </w:instrText>
-            </w:r>
-            <w:r>
-              <w:rPr>
-                <w:noProof/>
-                <w:webHidden/>
-              </w:rPr>
-            </w:r>
-            <w:r>
-              <w:rPr>
-                <w:noProof/>
-                <w:webHidden/>
-              </w:rPr>
-              <w:fldChar w:fldCharType="separate"/>
-            </w:r>
-            <w:r>
-              <w:rPr>
-                <w:noProof/>
-                <w:webHidden/>
-              </w:rPr>
-              <w:t>9</w:t>
-            </w:r>
-            <w:r>
-              <w:rPr>
-                <w:noProof/>
-                <w:webHidden/>
-              </w:rPr>
-              <w:fldChar w:fldCharType="end"/>
-            </w:r>
-          </w:hyperlink>
-        </w:p>
-        <w:p>
-          <w:pPr>
-            <w:pStyle w:val="TOC3"/>
-            <w:tabs>
-              <w:tab w:val="right" w:leader="dot" w:pos="10054"/>
-            </w:tabs>
-            <w:rPr>
-              <w:rFonts w:eastAsiaTheme="minorEastAsia"/>
-              <w:noProof/>
-              <w:lang w:eastAsia="en-GB" w:bidi="ar-SA"/>
-            </w:rPr>
-          </w:pPr>
-          <w:hyperlink w:anchor="_Toc203364720" w:history="1">
-            <w:r>
-              <w:rPr>
-                <w:rStyle w:val="Hyperlink"/>
-                <w:noProof/>
-              </w:rPr>
-              <w:t>Runtime Polymorphism (Method Overriding)</w:t>
-            </w:r>
-            <w:r>
-              <w:rPr>
-                <w:noProof/>
-                <w:webHidden/>
-              </w:rPr>
-              <w:tab/>
-            </w:r>
-            <w:r>
-              <w:rPr>
-                <w:noProof/>
-                <w:webHidden/>
-              </w:rPr>
-              <w:fldChar w:fldCharType="begin"/>
-            </w:r>
-            <w:r>
-              <w:rPr>
-                <w:noProof/>
-                <w:webHidden/>
-              </w:rPr>
-              <w:instrText xml:space="preserve"> PAGEREF _Toc203364720 \h </w:instrText>
-            </w:r>
-            <w:r>
-              <w:rPr>
-                <w:noProof/>
-                <w:webHidden/>
-              </w:rPr>
-            </w:r>
-            <w:r>
-              <w:rPr>
-                <w:noProof/>
-                <w:webHidden/>
-              </w:rPr>
-              <w:fldChar w:fldCharType="separate"/>
-            </w:r>
-            <w:r>
-              <w:rPr>
-                <w:noProof/>
-                <w:webHidden/>
-              </w:rPr>
-              <w:t>10</w:t>
+              <w:t>4</w:t>
             </w:r>
             <w:r>
               <w:rPr>
@@ -700,7 +776,7 @@
               <w:lang w:eastAsia="en-GB" w:bidi="ar-SA"/>
             </w:rPr>
           </w:pPr>
-          <w:hyperlink w:anchor="_Toc203364721" w:history="1">
+          <w:hyperlink w:anchor="_Toc203870353" w:history="1">
             <w:r>
               <w:rPr>
                 <w:rStyle w:val="Hyperlink"/>
@@ -725,7 +801,7 @@
                 <w:noProof/>
                 <w:lang w:eastAsia="en-GB"/>
               </w:rPr>
-              <w:t>Java-Specific Implementation of OOP</w:t>
+              <w:t>Core OOP Principles (Pillars of OOP)</w:t>
             </w:r>
             <w:r>
               <w:rPr>
@@ -746,7 +822,7 @@
                 <w:noProof/>
                 <w:webHidden/>
               </w:rPr>
-              <w:instrText xml:space="preserve"> PAGEREF _Toc203364721 \h </w:instrText>
+              <w:instrText xml:space="preserve"> PAGEREF _Toc203870353 \h </w:instrText>
             </w:r>
             <w:r>
               <w:rPr>
@@ -766,7 +842,567 @@
                 <w:noProof/>
                 <w:webHidden/>
               </w:rPr>
+              <w:t>5</w:t>
+            </w:r>
+            <w:r>
+              <w:rPr>
+                <w:noProof/>
+                <w:webHidden/>
+              </w:rPr>
+              <w:fldChar w:fldCharType="end"/>
+            </w:r>
+          </w:hyperlink>
+        </w:p>
+        <w:p>
+          <w:pPr>
+            <w:pStyle w:val="TOC2"/>
+            <w:tabs>
+              <w:tab w:val="right" w:leader="dot" w:pos="10054"/>
+            </w:tabs>
+            <w:rPr>
+              <w:rFonts w:eastAsiaTheme="minorEastAsia"/>
+              <w:noProof/>
+              <w:lang w:eastAsia="en-GB" w:bidi="ar-SA"/>
+            </w:rPr>
+          </w:pPr>
+          <w:hyperlink w:anchor="_Toc203870354" w:history="1">
+            <w:r>
+              <w:rPr>
+                <w:rStyle w:val="Hyperlink"/>
+                <w:noProof/>
+              </w:rPr>
+              <w:t>1. Class</w:t>
+            </w:r>
+            <w:r>
+              <w:rPr>
+                <w:noProof/>
+                <w:webHidden/>
+              </w:rPr>
+              <w:tab/>
+            </w:r>
+            <w:r>
+              <w:rPr>
+                <w:noProof/>
+                <w:webHidden/>
+              </w:rPr>
+              <w:fldChar w:fldCharType="begin"/>
+            </w:r>
+            <w:r>
+              <w:rPr>
+                <w:noProof/>
+                <w:webHidden/>
+              </w:rPr>
+              <w:instrText xml:space="preserve"> PAGEREF _Toc203870354 \h </w:instrText>
+            </w:r>
+            <w:r>
+              <w:rPr>
+                <w:noProof/>
+                <w:webHidden/>
+              </w:rPr>
+            </w:r>
+            <w:r>
+              <w:rPr>
+                <w:noProof/>
+                <w:webHidden/>
+              </w:rPr>
+              <w:fldChar w:fldCharType="separate"/>
+            </w:r>
+            <w:r>
+              <w:rPr>
+                <w:noProof/>
+                <w:webHidden/>
+              </w:rPr>
+              <w:t>6</w:t>
+            </w:r>
+            <w:r>
+              <w:rPr>
+                <w:noProof/>
+                <w:webHidden/>
+              </w:rPr>
+              <w:fldChar w:fldCharType="end"/>
+            </w:r>
+          </w:hyperlink>
+        </w:p>
+        <w:p>
+          <w:pPr>
+            <w:pStyle w:val="TOC2"/>
+            <w:tabs>
+              <w:tab w:val="right" w:leader="dot" w:pos="10054"/>
+            </w:tabs>
+            <w:rPr>
+              <w:rFonts w:eastAsiaTheme="minorEastAsia"/>
+              <w:noProof/>
+              <w:lang w:eastAsia="en-GB" w:bidi="ar-SA"/>
+            </w:rPr>
+          </w:pPr>
+          <w:hyperlink w:anchor="_Toc203870355" w:history="1">
+            <w:r>
+              <w:rPr>
+                <w:rStyle w:val="Hyperlink"/>
+                <w:noProof/>
+              </w:rPr>
+              <w:t>2. Object</w:t>
+            </w:r>
+            <w:r>
+              <w:rPr>
+                <w:noProof/>
+                <w:webHidden/>
+              </w:rPr>
+              <w:tab/>
+            </w:r>
+            <w:r>
+              <w:rPr>
+                <w:noProof/>
+                <w:webHidden/>
+              </w:rPr>
+              <w:fldChar w:fldCharType="begin"/>
+            </w:r>
+            <w:r>
+              <w:rPr>
+                <w:noProof/>
+                <w:webHidden/>
+              </w:rPr>
+              <w:instrText xml:space="preserve"> PAGEREF _Toc203870355 \h </w:instrText>
+            </w:r>
+            <w:r>
+              <w:rPr>
+                <w:noProof/>
+                <w:webHidden/>
+              </w:rPr>
+            </w:r>
+            <w:r>
+              <w:rPr>
+                <w:noProof/>
+                <w:webHidden/>
+              </w:rPr>
+              <w:fldChar w:fldCharType="separate"/>
+            </w:r>
+            <w:r>
+              <w:rPr>
+                <w:noProof/>
+                <w:webHidden/>
+              </w:rPr>
+              <w:t>7</w:t>
+            </w:r>
+            <w:r>
+              <w:rPr>
+                <w:noProof/>
+                <w:webHidden/>
+              </w:rPr>
+              <w:fldChar w:fldCharType="end"/>
+            </w:r>
+          </w:hyperlink>
+        </w:p>
+        <w:p>
+          <w:pPr>
+            <w:pStyle w:val="TOC2"/>
+            <w:tabs>
+              <w:tab w:val="right" w:leader="dot" w:pos="10054"/>
+            </w:tabs>
+            <w:rPr>
+              <w:rFonts w:eastAsiaTheme="minorEastAsia"/>
+              <w:noProof/>
+              <w:lang w:eastAsia="en-GB" w:bidi="ar-SA"/>
+            </w:rPr>
+          </w:pPr>
+          <w:hyperlink w:anchor="_Toc203870356" w:history="1">
+            <w:r>
+              <w:rPr>
+                <w:rStyle w:val="Hyperlink"/>
+                <w:noProof/>
+              </w:rPr>
+              <w:t>3. Abstraction</w:t>
+            </w:r>
+            <w:r>
+              <w:rPr>
+                <w:noProof/>
+                <w:webHidden/>
+              </w:rPr>
+              <w:tab/>
+            </w:r>
+            <w:r>
+              <w:rPr>
+                <w:noProof/>
+                <w:webHidden/>
+              </w:rPr>
+              <w:fldChar w:fldCharType="begin"/>
+            </w:r>
+            <w:r>
+              <w:rPr>
+                <w:noProof/>
+                <w:webHidden/>
+              </w:rPr>
+              <w:instrText xml:space="preserve"> PAGEREF _Toc203870356 \h </w:instrText>
+            </w:r>
+            <w:r>
+              <w:rPr>
+                <w:noProof/>
+                <w:webHidden/>
+              </w:rPr>
+            </w:r>
+            <w:r>
+              <w:rPr>
+                <w:noProof/>
+                <w:webHidden/>
+              </w:rPr>
+              <w:fldChar w:fldCharType="separate"/>
+            </w:r>
+            <w:r>
+              <w:rPr>
+                <w:noProof/>
+                <w:webHidden/>
+              </w:rPr>
+              <w:t>8</w:t>
+            </w:r>
+            <w:r>
+              <w:rPr>
+                <w:noProof/>
+                <w:webHidden/>
+              </w:rPr>
+              <w:fldChar w:fldCharType="end"/>
+            </w:r>
+          </w:hyperlink>
+        </w:p>
+        <w:p>
+          <w:pPr>
+            <w:pStyle w:val="TOC2"/>
+            <w:tabs>
+              <w:tab w:val="right" w:leader="dot" w:pos="10054"/>
+            </w:tabs>
+            <w:rPr>
+              <w:rFonts w:eastAsiaTheme="minorEastAsia"/>
+              <w:noProof/>
+              <w:lang w:eastAsia="en-GB" w:bidi="ar-SA"/>
+            </w:rPr>
+          </w:pPr>
+          <w:hyperlink w:anchor="_Toc203870357" w:history="1">
+            <w:r>
+              <w:rPr>
+                <w:rStyle w:val="Hyperlink"/>
+                <w:noProof/>
+              </w:rPr>
+              <w:t>4. Encapsulation</w:t>
+            </w:r>
+            <w:r>
+              <w:rPr>
+                <w:noProof/>
+                <w:webHidden/>
+              </w:rPr>
+              <w:tab/>
+            </w:r>
+            <w:r>
+              <w:rPr>
+                <w:noProof/>
+                <w:webHidden/>
+              </w:rPr>
+              <w:fldChar w:fldCharType="begin"/>
+            </w:r>
+            <w:r>
+              <w:rPr>
+                <w:noProof/>
+                <w:webHidden/>
+              </w:rPr>
+              <w:instrText xml:space="preserve"> PAGEREF _Toc203870357 \h </w:instrText>
+            </w:r>
+            <w:r>
+              <w:rPr>
+                <w:noProof/>
+                <w:webHidden/>
+              </w:rPr>
+            </w:r>
+            <w:r>
+              <w:rPr>
+                <w:noProof/>
+                <w:webHidden/>
+              </w:rPr>
+              <w:fldChar w:fldCharType="separate"/>
+            </w:r>
+            <w:r>
+              <w:rPr>
+                <w:noProof/>
+                <w:webHidden/>
+              </w:rPr>
+              <w:t>9</w:t>
+            </w:r>
+            <w:r>
+              <w:rPr>
+                <w:noProof/>
+                <w:webHidden/>
+              </w:rPr>
+              <w:fldChar w:fldCharType="end"/>
+            </w:r>
+          </w:hyperlink>
+        </w:p>
+        <w:p>
+          <w:pPr>
+            <w:pStyle w:val="TOC2"/>
+            <w:tabs>
+              <w:tab w:val="right" w:leader="dot" w:pos="10054"/>
+            </w:tabs>
+            <w:rPr>
+              <w:rFonts w:eastAsiaTheme="minorEastAsia"/>
+              <w:noProof/>
+              <w:lang w:eastAsia="en-GB" w:bidi="ar-SA"/>
+            </w:rPr>
+          </w:pPr>
+          <w:hyperlink w:anchor="_Toc203870358" w:history="1">
+            <w:r>
+              <w:rPr>
+                <w:rStyle w:val="Hyperlink"/>
+                <w:noProof/>
+              </w:rPr>
+              <w:t>5. Inheritance</w:t>
+            </w:r>
+            <w:r>
+              <w:rPr>
+                <w:noProof/>
+                <w:webHidden/>
+              </w:rPr>
+              <w:tab/>
+            </w:r>
+            <w:r>
+              <w:rPr>
+                <w:noProof/>
+                <w:webHidden/>
+              </w:rPr>
+              <w:fldChar w:fldCharType="begin"/>
+            </w:r>
+            <w:r>
+              <w:rPr>
+                <w:noProof/>
+                <w:webHidden/>
+              </w:rPr>
+              <w:instrText xml:space="preserve"> PAGEREF _Toc203870358 \h </w:instrText>
+            </w:r>
+            <w:r>
+              <w:rPr>
+                <w:noProof/>
+                <w:webHidden/>
+              </w:rPr>
+            </w:r>
+            <w:r>
+              <w:rPr>
+                <w:noProof/>
+                <w:webHidden/>
+              </w:rPr>
+              <w:fldChar w:fldCharType="separate"/>
+            </w:r>
+            <w:r>
+              <w:rPr>
+                <w:noProof/>
+                <w:webHidden/>
+              </w:rPr>
+              <w:t>10</w:t>
+            </w:r>
+            <w:r>
+              <w:rPr>
+                <w:noProof/>
+                <w:webHidden/>
+              </w:rPr>
+              <w:fldChar w:fldCharType="end"/>
+            </w:r>
+          </w:hyperlink>
+        </w:p>
+        <w:p>
+          <w:pPr>
+            <w:pStyle w:val="TOC2"/>
+            <w:tabs>
+              <w:tab w:val="right" w:leader="dot" w:pos="10054"/>
+            </w:tabs>
+            <w:rPr>
+              <w:rFonts w:eastAsiaTheme="minorEastAsia"/>
+              <w:noProof/>
+              <w:lang w:eastAsia="en-GB" w:bidi="ar-SA"/>
+            </w:rPr>
+          </w:pPr>
+          <w:hyperlink w:anchor="_Toc203870359" w:history="1">
+            <w:r>
+              <w:rPr>
+                <w:rStyle w:val="Hyperlink"/>
+                <w:noProof/>
+              </w:rPr>
+              <w:t>6. Polymorphism</w:t>
+            </w:r>
+            <w:r>
+              <w:rPr>
+                <w:noProof/>
+                <w:webHidden/>
+              </w:rPr>
+              <w:tab/>
+            </w:r>
+            <w:r>
+              <w:rPr>
+                <w:noProof/>
+                <w:webHidden/>
+              </w:rPr>
+              <w:fldChar w:fldCharType="begin"/>
+            </w:r>
+            <w:r>
+              <w:rPr>
+                <w:noProof/>
+                <w:webHidden/>
+              </w:rPr>
+              <w:instrText xml:space="preserve"> PAGEREF _Toc203870359 \h </w:instrText>
+            </w:r>
+            <w:r>
+              <w:rPr>
+                <w:noProof/>
+                <w:webHidden/>
+              </w:rPr>
+            </w:r>
+            <w:r>
+              <w:rPr>
+                <w:noProof/>
+                <w:webHidden/>
+              </w:rPr>
+              <w:fldChar w:fldCharType="separate"/>
+            </w:r>
+            <w:r>
+              <w:rPr>
+                <w:noProof/>
+                <w:webHidden/>
+              </w:rPr>
               <w:t>11</w:t>
+            </w:r>
+            <w:r>
+              <w:rPr>
+                <w:noProof/>
+                <w:webHidden/>
+              </w:rPr>
+              <w:fldChar w:fldCharType="end"/>
+            </w:r>
+          </w:hyperlink>
+        </w:p>
+        <w:p>
+          <w:pPr>
+            <w:pStyle w:val="TOC3"/>
+            <w:tabs>
+              <w:tab w:val="right" w:leader="dot" w:pos="10054"/>
+            </w:tabs>
+            <w:rPr>
+              <w:rFonts w:eastAsiaTheme="minorEastAsia"/>
+              <w:noProof/>
+              <w:lang w:eastAsia="en-GB" w:bidi="ar-SA"/>
+            </w:rPr>
+          </w:pPr>
+          <w:hyperlink w:anchor="_Toc203870360" w:history="1">
+            <w:r>
+              <w:rPr>
+                <w:rStyle w:val="Hyperlink"/>
+                <w:noProof/>
+              </w:rPr>
+              <w:t>Compile-time Polymorphism (Method Overloading)</w:t>
+            </w:r>
+            <w:r>
+              <w:rPr>
+                <w:noProof/>
+                <w:webHidden/>
+              </w:rPr>
+              <w:tab/>
+            </w:r>
+            <w:r>
+              <w:rPr>
+                <w:noProof/>
+                <w:webHidden/>
+              </w:rPr>
+              <w:fldChar w:fldCharType="begin"/>
+            </w:r>
+            <w:r>
+              <w:rPr>
+                <w:noProof/>
+                <w:webHidden/>
+              </w:rPr>
+              <w:instrText xml:space="preserve"> PAGEREF _Toc203870360 \h </w:instrText>
+            </w:r>
+            <w:r>
+              <w:rPr>
+                <w:noProof/>
+                <w:webHidden/>
+              </w:rPr>
+            </w:r>
+            <w:r>
+              <w:rPr>
+                <w:noProof/>
+                <w:webHidden/>
+              </w:rPr>
+              <w:fldChar w:fldCharType="separate"/>
+            </w:r>
+            <w:r>
+              <w:rPr>
+                <w:noProof/>
+                <w:webHidden/>
+              </w:rPr>
+              <w:t>11</w:t>
+            </w:r>
+            <w:r>
+              <w:rPr>
+                <w:noProof/>
+                <w:webHidden/>
+              </w:rPr>
+              <w:fldChar w:fldCharType="end"/>
+            </w:r>
+          </w:hyperlink>
+        </w:p>
+        <w:p>
+          <w:pPr>
+            <w:pStyle w:val="TOC3"/>
+            <w:tabs>
+              <w:tab w:val="right" w:leader="dot" w:pos="10054"/>
+            </w:tabs>
+            <w:rPr>
+              <w:rFonts w:eastAsiaTheme="minorEastAsia"/>
+              <w:noProof/>
+              <w:lang w:eastAsia="en-GB" w:bidi="ar-SA"/>
+            </w:rPr>
+          </w:pPr>
+          <w:hyperlink w:anchor="_Toc203870361" w:history="1">
+            <w:r>
+              <w:rPr>
+                <w:rStyle w:val="Hyperlink"/>
+                <w:noProof/>
+              </w:rPr>
+              <w:t>Runtime Polymorphism (Method Overriding)</w:t>
+            </w:r>
+            <w:r>
+              <w:rPr>
+                <w:noProof/>
+                <w:webHidden/>
+              </w:rPr>
+              <w:tab/>
+            </w:r>
+            <w:r>
+              <w:rPr>
+                <w:noProof/>
+                <w:webHidden/>
+              </w:rPr>
+              <w:fldChar w:fldCharType="begin"/>
+            </w:r>
+            <w:r>
+              <w:rPr>
+                <w:noProof/>
+                <w:webHidden/>
+              </w:rPr>
+              <w:instrText xml:space="preserve"> PAGEREF _Toc203870361 \h </w:instrText>
+            </w:r>
+            <w:r>
+              <w:rPr>
+                <w:noProof/>
+                <w:webHidden/>
+              </w:rPr>
+            </w:r>
+            <w:r>
+              <w:rPr>
+                <w:noProof/>
+                <w:webHidden/>
+              </w:rPr>
+              <w:fldChar w:fldCharType="separate"/>
+            </w:r>
+            <w:r>
+              <w:rPr>
+                <w:noProof/>
+                <w:webHidden/>
+              </w:rPr>
+              <w:t>12</w:t>
             </w:r>
             <w:r>
               <w:rPr>
@@ -790,7 +1426,7 @@
               <w:lang w:eastAsia="en-GB" w:bidi="ar-SA"/>
             </w:rPr>
           </w:pPr>
-          <w:hyperlink w:anchor="_Toc203364722" w:history="1">
+          <w:hyperlink w:anchor="_Toc203870362" w:history="1">
             <w:r>
               <w:rPr>
                 <w:rStyle w:val="Hyperlink"/>
@@ -815,7 +1451,7 @@
                 <w:noProof/>
                 <w:lang w:eastAsia="en-GB"/>
               </w:rPr>
-              <w:t>Inheritance in Java</w:t>
+              <w:t>Java-Specific Implementation of OOP</w:t>
             </w:r>
             <w:r>
               <w:rPr>
@@ -836,7 +1472,7 @@
                 <w:noProof/>
                 <w:webHidden/>
               </w:rPr>
-              <w:instrText xml:space="preserve"> PAGEREF _Toc203364722 \h </w:instrText>
+              <w:instrText xml:space="preserve"> PAGEREF _Toc203870362 \h </w:instrText>
             </w:r>
             <w:r>
               <w:rPr>
@@ -856,7 +1492,7 @@
                 <w:noProof/>
                 <w:webHidden/>
               </w:rPr>
-              <w:t>11</w:t>
+              <w:t>13</w:t>
             </w:r>
             <w:r>
               <w:rPr>
@@ -880,7 +1516,7 @@
               <w:lang w:eastAsia="en-GB" w:bidi="ar-SA"/>
             </w:rPr>
           </w:pPr>
-          <w:hyperlink w:anchor="_Toc203364723" w:history="1">
+          <w:hyperlink w:anchor="_Toc203870363" w:history="1">
             <w:r>
               <w:rPr>
                 <w:rStyle w:val="Hyperlink"/>
@@ -905,7 +1541,7 @@
                 <w:noProof/>
                 <w:lang w:eastAsia="en-GB"/>
               </w:rPr>
-              <w:t>Polymorphism in Java</w:t>
+              <w:t>Inheritance in Java</w:t>
             </w:r>
             <w:r>
               <w:rPr>
@@ -926,7 +1562,7 @@
                 <w:noProof/>
                 <w:webHidden/>
               </w:rPr>
-              <w:instrText xml:space="preserve"> PAGEREF _Toc203364723 \h </w:instrText>
+              <w:instrText xml:space="preserve"> PAGEREF _Toc203870363 \h </w:instrText>
             </w:r>
             <w:r>
               <w:rPr>
@@ -946,7 +1582,7 @@
                 <w:noProof/>
                 <w:webHidden/>
               </w:rPr>
-              <w:t>11</w:t>
+              <w:t>13</w:t>
             </w:r>
             <w:r>
               <w:rPr>
@@ -970,7 +1606,7 @@
               <w:lang w:eastAsia="en-GB" w:bidi="ar-SA"/>
             </w:rPr>
           </w:pPr>
-          <w:hyperlink w:anchor="_Toc203364724" w:history="1">
+          <w:hyperlink w:anchor="_Toc203870364" w:history="1">
             <w:r>
               <w:rPr>
                 <w:rStyle w:val="Hyperlink"/>
@@ -995,7 +1631,7 @@
                 <w:noProof/>
                 <w:lang w:eastAsia="en-GB"/>
               </w:rPr>
-              <w:t>Abstraction in Java</w:t>
+              <w:t>Polymorphism in Java</w:t>
             </w:r>
             <w:r>
               <w:rPr>
@@ -1016,7 +1652,7 @@
                 <w:noProof/>
                 <w:webHidden/>
               </w:rPr>
-              <w:instrText xml:space="preserve"> PAGEREF _Toc203364724 \h </w:instrText>
+              <w:instrText xml:space="preserve"> PAGEREF _Toc203870364 \h </w:instrText>
             </w:r>
             <w:r>
               <w:rPr>
@@ -1036,7 +1672,7 @@
                 <w:noProof/>
                 <w:webHidden/>
               </w:rPr>
-              <w:t>12</w:t>
+              <w:t>13</w:t>
             </w:r>
             <w:r>
               <w:rPr>
@@ -1060,7 +1696,7 @@
               <w:lang w:eastAsia="en-GB" w:bidi="ar-SA"/>
             </w:rPr>
           </w:pPr>
-          <w:hyperlink w:anchor="_Toc203364725" w:history="1">
+          <w:hyperlink w:anchor="_Toc203870365" w:history="1">
             <w:r>
               <w:rPr>
                 <w:rStyle w:val="Hyperlink"/>
@@ -1085,7 +1721,7 @@
                 <w:noProof/>
                 <w:lang w:eastAsia="en-GB"/>
               </w:rPr>
-              <w:t>Encapsulation in Java</w:t>
+              <w:t>Abstraction in Java</w:t>
             </w:r>
             <w:r>
               <w:rPr>
@@ -1106,7 +1742,7 @@
                 <w:noProof/>
                 <w:webHidden/>
               </w:rPr>
-              <w:instrText xml:space="preserve"> PAGEREF _Toc203364725 \h </w:instrText>
+              <w:instrText xml:space="preserve"> PAGEREF _Toc203870365 \h </w:instrText>
             </w:r>
             <w:r>
               <w:rPr>
@@ -1126,7 +1762,7 @@
                 <w:noProof/>
                 <w:webHidden/>
               </w:rPr>
-              <w:t>12</w:t>
+              <w:t>14</w:t>
             </w:r>
             <w:r>
               <w:rPr>
@@ -1150,7 +1786,7 @@
               <w:lang w:eastAsia="en-GB" w:bidi="ar-SA"/>
             </w:rPr>
           </w:pPr>
-          <w:hyperlink w:anchor="_Toc203364726" w:history="1">
+          <w:hyperlink w:anchor="_Toc203870366" w:history="1">
             <w:r>
               <w:rPr>
                 <w:rStyle w:val="Hyperlink"/>
@@ -1175,7 +1811,7 @@
                 <w:noProof/>
                 <w:lang w:eastAsia="en-GB"/>
               </w:rPr>
-              <w:t>Advanced OOP Features</w:t>
+              <w:t>Encapsulation in Java</w:t>
             </w:r>
             <w:r>
               <w:rPr>
@@ -1196,7 +1832,7 @@
                 <w:noProof/>
                 <w:webHidden/>
               </w:rPr>
-              <w:instrText xml:space="preserve"> PAGEREF _Toc203364726 \h </w:instrText>
+              <w:instrText xml:space="preserve"> PAGEREF _Toc203870366 \h </w:instrText>
             </w:r>
             <w:r>
               <w:rPr>
@@ -1216,7 +1852,7 @@
                 <w:noProof/>
                 <w:webHidden/>
               </w:rPr>
-              <w:t>12</w:t>
+              <w:t>14</w:t>
             </w:r>
             <w:r>
               <w:rPr>
@@ -1240,7 +1876,7 @@
               <w:lang w:eastAsia="en-GB" w:bidi="ar-SA"/>
             </w:rPr>
           </w:pPr>
-          <w:hyperlink w:anchor="_Toc203364727" w:history="1">
+          <w:hyperlink w:anchor="_Toc203870367" w:history="1">
             <w:r>
               <w:rPr>
                 <w:rStyle w:val="Hyperlink"/>
@@ -1265,6 +1901,96 @@
                 <w:noProof/>
                 <w:lang w:eastAsia="en-GB"/>
               </w:rPr>
+              <w:t>Advanced OOP Features</w:t>
+            </w:r>
+            <w:r>
+              <w:rPr>
+                <w:noProof/>
+                <w:webHidden/>
+              </w:rPr>
+              <w:tab/>
+            </w:r>
+            <w:r>
+              <w:rPr>
+                <w:noProof/>
+                <w:webHidden/>
+              </w:rPr>
+              <w:fldChar w:fldCharType="begin"/>
+            </w:r>
+            <w:r>
+              <w:rPr>
+                <w:noProof/>
+                <w:webHidden/>
+              </w:rPr>
+              <w:instrText xml:space="preserve"> PAGEREF _Toc203870367 \h </w:instrText>
+            </w:r>
+            <w:r>
+              <w:rPr>
+                <w:noProof/>
+                <w:webHidden/>
+              </w:rPr>
+            </w:r>
+            <w:r>
+              <w:rPr>
+                <w:noProof/>
+                <w:webHidden/>
+              </w:rPr>
+              <w:fldChar w:fldCharType="separate"/>
+            </w:r>
+            <w:r>
+              <w:rPr>
+                <w:noProof/>
+                <w:webHidden/>
+              </w:rPr>
+              <w:t>14</w:t>
+            </w:r>
+            <w:r>
+              <w:rPr>
+                <w:noProof/>
+                <w:webHidden/>
+              </w:rPr>
+              <w:fldChar w:fldCharType="end"/>
+            </w:r>
+          </w:hyperlink>
+        </w:p>
+        <w:p>
+          <w:pPr>
+            <w:pStyle w:val="TOC1"/>
+            <w:tabs>
+              <w:tab w:val="left" w:pos="440"/>
+              <w:tab w:val="right" w:leader="dot" w:pos="10054"/>
+            </w:tabs>
+            <w:rPr>
+              <w:rFonts w:eastAsiaTheme="minorEastAsia"/>
+              <w:noProof/>
+              <w:lang w:eastAsia="en-GB" w:bidi="ar-SA"/>
+            </w:rPr>
+          </w:pPr>
+          <w:hyperlink w:anchor="_Toc203870368" w:history="1">
+            <w:r>
+              <w:rPr>
+                <w:rStyle w:val="Hyperlink"/>
+                <w:rFonts w:eastAsia="Times New Roman"/>
+                <w:noProof/>
+                <w:lang w:eastAsia="en-GB"/>
+              </w:rPr>
+              <w:t>9.</w:t>
+            </w:r>
+            <w:r>
+              <w:rPr>
+                <w:rFonts w:eastAsiaTheme="minorEastAsia"/>
+                <w:noProof/>
+                <w:lang w:eastAsia="en-GB" w:bidi="ar-SA"/>
+              </w:rPr>
+              <w:tab/>
+            </w:r>
+            <w:r>
+              <w:rPr>
+                <w:rStyle w:val="Hyperlink"/>
+                <w:rFonts w:eastAsia="Times New Roman"/>
+                <w:noProof/>
+                <w:lang w:eastAsia="en-GB"/>
+              </w:rPr>
               <w:t>OOP Design Concepts (For Deeper Understanding)</w:t>
             </w:r>
             <w:r>
@@ -1286,7 +2012,7 @@
                 <w:noProof/>
                 <w:webHidden/>
               </w:rPr>
-              <w:instrText xml:space="preserve"> PAGEREF _Toc203364727 \h </w:instrText>
+              <w:instrText xml:space="preserve"> PAGEREF _Toc203870368 \h </w:instrText>
             </w:r>
             <w:r>
               <w:rPr>
@@ -1306,7 +2032,7 @@
                 <w:noProof/>
                 <w:webHidden/>
               </w:rPr>
-              <w:t>12</w:t>
+              <w:t>14</w:t>
             </w:r>
             <w:r>
               <w:rPr>
@@ -1329,7 +2055,7 @@
               <w:lang w:eastAsia="en-GB" w:bidi="ar-SA"/>
             </w:rPr>
           </w:pPr>
-          <w:hyperlink w:anchor="_Toc203364728" w:history="1">
+          <w:hyperlink w:anchor="_Toc203870369" w:history="1">
             <w:r>
               <w:rPr>
                 <w:rStyle w:val="Hyperlink"/>
@@ -1356,7 +2082,7 @@
                 <w:noProof/>
                 <w:webHidden/>
               </w:rPr>
-              <w:instrText xml:space="preserve"> PAGEREF _Toc203364728 \h </w:instrText>
+              <w:instrText xml:space="preserve"> PAGEREF _Toc203870369 \h </w:instrText>
             </w:r>
             <w:r>
               <w:rPr>
@@ -1376,7 +2102,7 @@
                 <w:noProof/>
                 <w:webHidden/>
               </w:rPr>
-              <w:t>13</w:t>
+              <w:t>15</w:t>
             </w:r>
             <w:r>
               <w:rPr>
@@ -1399,7 +2125,7 @@
               <w:lang w:eastAsia="en-GB" w:bidi="ar-SA"/>
             </w:rPr>
           </w:pPr>
-          <w:hyperlink w:anchor="_Toc203364729" w:history="1">
+          <w:hyperlink w:anchor="_Toc203870370" w:history="1">
             <w:r>
               <w:rPr>
                 <w:rStyle w:val="Hyperlink"/>
@@ -1426,7 +2152,7 @@
                 <w:noProof/>
                 <w:webHidden/>
               </w:rPr>
-              <w:instrText xml:space="preserve"> PAGEREF _Toc203364729 \h </w:instrText>
+              <w:instrText xml:space="preserve"> PAGEREF _Toc203870370 \h </w:instrText>
             </w:r>
             <w:r>
               <w:rPr>
@@ -1446,7 +2172,7 @@
                 <w:noProof/>
                 <w:webHidden/>
               </w:rPr>
-              <w:t>13</w:t>
+              <w:t>15</w:t>
             </w:r>
             <w:r>
               <w:rPr>
@@ -1469,7 +2195,7 @@
               <w:lang w:eastAsia="en-GB" w:bidi="ar-SA"/>
             </w:rPr>
           </w:pPr>
-          <w:hyperlink w:anchor="_Toc203364730" w:history="1">
+          <w:hyperlink w:anchor="_Toc203870371" w:history="1">
             <w:r>
               <w:rPr>
                 <w:rStyle w:val="Hyperlink"/>
@@ -1496,7 +2222,7 @@
                 <w:noProof/>
                 <w:webHidden/>
               </w:rPr>
-              <w:instrText xml:space="preserve"> PAGEREF _Toc203364730 \h </w:instrText>
+              <w:instrText xml:space="preserve"> PAGEREF _Toc203870371 \h </w:instrText>
             </w:r>
             <w:r>
               <w:rPr>
@@ -1516,7 +2242,7 @@
                 <w:noProof/>
                 <w:webHidden/>
               </w:rPr>
-              <w:t>13</w:t>
+              <w:t>15</w:t>
             </w:r>
             <w:r>
               <w:rPr>
@@ -1539,7 +2265,7 @@
               <w:lang w:eastAsia="en-GB" w:bidi="ar-SA"/>
             </w:rPr>
           </w:pPr>
-          <w:hyperlink w:anchor="_Toc203364731" w:history="1">
+          <w:hyperlink w:anchor="_Toc203870372" w:history="1">
             <w:r>
               <w:rPr>
                 <w:rStyle w:val="Hyperlink"/>
@@ -1566,7 +2292,7 @@
                 <w:noProof/>
                 <w:webHidden/>
               </w:rPr>
-              <w:instrText xml:space="preserve"> PAGEREF _Toc203364731 \h </w:instrText>
+              <w:instrText xml:space="preserve"> PAGEREF _Toc203870372 \h </w:instrText>
             </w:r>
             <w:r>
               <w:rPr>
@@ -1586,7 +2312,7 @@
                 <w:noProof/>
                 <w:webHidden/>
               </w:rPr>
-              <w:t>14</w:t>
+              <w:t>16</w:t>
             </w:r>
             <w:r>
               <w:rPr>
@@ -1609,7 +2335,7 @@
               <w:lang w:eastAsia="en-GB" w:bidi="ar-SA"/>
             </w:rPr>
           </w:pPr>
-          <w:hyperlink w:anchor="_Toc203364732" w:history="1">
+          <w:hyperlink w:anchor="_Toc203870373" w:history="1">
             <w:r>
               <w:rPr>
                 <w:rStyle w:val="Hyperlink"/>
@@ -1636,7 +2362,7 @@
                 <w:noProof/>
                 <w:webHidden/>
               </w:rPr>
-              <w:instrText xml:space="preserve"> PAGEREF _Toc203364732 \h </w:instrText>
+              <w:instrText xml:space="preserve"> PAGEREF _Toc203870373 \h </w:instrText>
             </w:r>
             <w:r>
               <w:rPr>
@@ -1656,7 +2382,7 @@
                 <w:noProof/>
                 <w:webHidden/>
               </w:rPr>
-              <w:t>16</w:t>
+              <w:t>18</w:t>
             </w:r>
             <w:r>
               <w:rPr>
@@ -1679,7 +2405,7 @@
               <w:lang w:eastAsia="en-GB" w:bidi="ar-SA"/>
             </w:rPr>
           </w:pPr>
-          <w:hyperlink w:anchor="_Toc203364733" w:history="1">
+          <w:hyperlink w:anchor="_Toc203870374" w:history="1">
             <w:r>
               <w:rPr>
                 <w:rStyle w:val="Hyperlink"/>
@@ -1706,7 +2432,7 @@
                 <w:noProof/>
                 <w:webHidden/>
               </w:rPr>
-              <w:instrText xml:space="preserve"> PAGEREF _Toc203364733 \h </w:instrText>
+              <w:instrText xml:space="preserve"> PAGEREF _Toc203870374 \h </w:instrText>
             </w:r>
             <w:r>
               <w:rPr>
@@ -1726,7 +2452,7 @@
                 <w:noProof/>
                 <w:webHidden/>
               </w:rPr>
-              <w:t>18</w:t>
+              <w:t>20</w:t>
             </w:r>
             <w:r>
               <w:rPr>
@@ -1749,7 +2475,7 @@
               <w:lang w:eastAsia="en-GB" w:bidi="ar-SA"/>
             </w:rPr>
           </w:pPr>
-          <w:hyperlink w:anchor="_Toc203364734" w:history="1">
+          <w:hyperlink w:anchor="_Toc203870375" w:history="1">
             <w:r>
               <w:rPr>
                 <w:rStyle w:val="Hyperlink"/>
@@ -1776,7 +2502,7 @@
                 <w:noProof/>
                 <w:webHidden/>
               </w:rPr>
-              <w:instrText xml:space="preserve"> PAGEREF _Toc203364734 \h </w:instrText>
+              <w:instrText xml:space="preserve"> PAGEREF _Toc203870375 \h </w:instrText>
             </w:r>
             <w:r>
               <w:rPr>
@@ -1796,7 +2522,7 @@
                 <w:noProof/>
                 <w:webHidden/>
               </w:rPr>
-              <w:t>18</w:t>
+              <w:t>20</w:t>
             </w:r>
             <w:r>
               <w:rPr>
@@ -1819,7 +2545,7 @@
               <w:lang w:eastAsia="en-GB" w:bidi="ar-SA"/>
             </w:rPr>
           </w:pPr>
-          <w:hyperlink w:anchor="_Toc203364735" w:history="1">
+          <w:hyperlink w:anchor="_Toc203870376" w:history="1">
             <w:r>
               <w:rPr>
                 <w:rStyle w:val="Hyperlink"/>
@@ -1846,7 +2572,7 @@
                 <w:noProof/>
                 <w:webHidden/>
               </w:rPr>
-              <w:instrText xml:space="preserve"> PAGEREF _Toc203364735 \h </w:instrText>
+              <w:instrText xml:space="preserve"> PAGEREF _Toc203870376 \h </w:instrText>
             </w:r>
             <w:r>
               <w:rPr>
@@ -1866,7 +2592,7 @@
                 <w:noProof/>
                 <w:webHidden/>
               </w:rPr>
-              <w:t>18</w:t>
+              <w:t>20</w:t>
             </w:r>
             <w:r>
               <w:rPr>
@@ -1889,7 +2615,7 @@
               <w:lang w:eastAsia="en-GB" w:bidi="ar-SA"/>
             </w:rPr>
           </w:pPr>
-          <w:hyperlink w:anchor="_Toc203364736" w:history="1">
+          <w:hyperlink w:anchor="_Toc203870377" w:history="1">
             <w:r>
               <w:rPr>
                 <w:rStyle w:val="Hyperlink"/>
@@ -1916,7 +2642,7 @@
                 <w:noProof/>
                 <w:webHidden/>
               </w:rPr>
-              <w:instrText xml:space="preserve"> PAGEREF _Toc203364736 \h </w:instrText>
+              <w:instrText xml:space="preserve"> PAGEREF _Toc203870377 \h </w:instrText>
             </w:r>
             <w:r>
               <w:rPr>
@@ -1936,7 +2662,7 @@
                 <w:noProof/>
                 <w:webHidden/>
               </w:rPr>
-              <w:t>18</w:t>
+              <w:t>20</w:t>
             </w:r>
             <w:r>
               <w:rPr>
@@ -1959,7 +2685,7 @@
               <w:lang w:eastAsia="en-GB" w:bidi="ar-SA"/>
             </w:rPr>
           </w:pPr>
-          <w:hyperlink w:anchor="_Toc203364737" w:history="1">
+          <w:hyperlink w:anchor="_Toc203870378" w:history="1">
             <w:r>
               <w:rPr>
                 <w:rStyle w:val="Hyperlink"/>
@@ -1986,7 +2712,7 @@
                 <w:noProof/>
                 <w:webHidden/>
               </w:rPr>
-              <w:instrText xml:space="preserve"> PAGEREF _Toc203364737 \h </w:instrText>
+              <w:instrText xml:space="preserve"> PAGEREF _Toc203870378 \h </w:instrText>
             </w:r>
             <w:r>
               <w:rPr>
@@ -2006,7 +2732,7 @@
                 <w:noProof/>
                 <w:webHidden/>
               </w:rPr>
-              <w:t>20</w:t>
+              <w:t>22</w:t>
             </w:r>
             <w:r>
               <w:rPr>
@@ -2029,7 +2755,7 @@
               <w:lang w:eastAsia="en-GB" w:bidi="ar-SA"/>
             </w:rPr>
           </w:pPr>
-          <w:hyperlink w:anchor="_Toc203364738" w:history="1">
+          <w:hyperlink w:anchor="_Toc203870379" w:history="1">
             <w:r>
               <w:rPr>
                 <w:rStyle w:val="Hyperlink"/>
@@ -2056,7 +2782,7 @@
                 <w:noProof/>
                 <w:webHidden/>
               </w:rPr>
-              <w:instrText xml:space="preserve"> PAGEREF _Toc203364738 \h </w:instrText>
+              <w:instrText xml:space="preserve"> PAGEREF _Toc203870379 \h </w:instrText>
             </w:r>
             <w:r>
               <w:rPr>
@@ -2076,7 +2802,7 @@
                 <w:noProof/>
                 <w:webHidden/>
               </w:rPr>
-              <w:t>20</w:t>
+              <w:t>22</w:t>
             </w:r>
             <w:r>
               <w:rPr>
@@ -2099,7 +2825,7 @@
               <w:lang w:eastAsia="en-GB" w:bidi="ar-SA"/>
             </w:rPr>
           </w:pPr>
-          <w:hyperlink w:anchor="_Toc203364739" w:history="1">
+          <w:hyperlink w:anchor="_Toc203870380" w:history="1">
             <w:r>
               <w:rPr>
                 <w:rStyle w:val="Hyperlink"/>
@@ -2126,7 +2852,7 @@
                 <w:noProof/>
                 <w:webHidden/>
               </w:rPr>
-              <w:instrText xml:space="preserve"> PAGEREF _Toc203364739 \h </w:instrText>
+              <w:instrText xml:space="preserve"> PAGEREF _Toc203870380 \h </w:instrText>
             </w:r>
             <w:r>
               <w:rPr>
@@ -2146,7 +2872,7 @@
                 <w:noProof/>
                 <w:webHidden/>
               </w:rPr>
-              <w:t>20</w:t>
+              <w:t>22</w:t>
             </w:r>
             <w:r>
               <w:rPr>
@@ -2169,7 +2895,7 @@
               <w:lang w:eastAsia="en-GB" w:bidi="ar-SA"/>
             </w:rPr>
           </w:pPr>
-          <w:hyperlink w:anchor="_Toc203364740" w:history="1">
+          <w:hyperlink w:anchor="_Toc203870381" w:history="1">
             <w:r>
               <w:rPr>
                 <w:rStyle w:val="Hyperlink"/>
@@ -2196,7 +2922,7 @@
                 <w:noProof/>
                 <w:webHidden/>
               </w:rPr>
-              <w:instrText xml:space="preserve"> PAGEREF _Toc203364740 \h </w:instrText>
+              <w:instrText xml:space="preserve"> PAGEREF _Toc203870381 \h </w:instrText>
             </w:r>
             <w:r>
               <w:rPr>
@@ -2216,7 +2942,7 @@
                 <w:noProof/>
                 <w:webHidden/>
               </w:rPr>
-              <w:t>21</w:t>
+              <w:t>23</w:t>
             </w:r>
             <w:r>
               <w:rPr>
@@ -2239,7 +2965,7 @@
               <w:lang w:eastAsia="en-GB" w:bidi="ar-SA"/>
             </w:rPr>
           </w:pPr>
-          <w:hyperlink w:anchor="_Toc203364741" w:history="1">
+          <w:hyperlink w:anchor="_Toc203870382" w:history="1">
             <w:r>
               <w:rPr>
                 <w:rStyle w:val="Hyperlink"/>
@@ -2266,7 +2992,7 @@
                 <w:noProof/>
                 <w:webHidden/>
               </w:rPr>
-              <w:instrText xml:space="preserve"> PAGEREF _Toc203364741 \h </w:instrText>
+              <w:instrText xml:space="preserve"> PAGEREF _Toc203870382 \h </w:instrText>
             </w:r>
             <w:r>
               <w:rPr>
@@ -2286,7 +3012,7 @@
                 <w:noProof/>
                 <w:webHidden/>
               </w:rPr>
-              <w:t>21</w:t>
+              <w:t>23</w:t>
             </w:r>
             <w:r>
               <w:rPr>
@@ -2309,7 +3035,7 @@
               <w:lang w:eastAsia="en-GB" w:bidi="ar-SA"/>
             </w:rPr>
           </w:pPr>
-          <w:hyperlink w:anchor="_Toc203364742" w:history="1">
+          <w:hyperlink w:anchor="_Toc203870383" w:history="1">
             <w:r>
               <w:rPr>
                 <w:rStyle w:val="Hyperlink"/>
@@ -2336,7 +3062,7 @@
                 <w:noProof/>
                 <w:webHidden/>
               </w:rPr>
-              <w:instrText xml:space="preserve"> PAGEREF _Toc203364742 \h </w:instrText>
+              <w:instrText xml:space="preserve"> PAGEREF _Toc203870383 \h </w:instrText>
             </w:r>
             <w:r>
               <w:rPr>
@@ -2356,7 +3082,7 @@
                 <w:noProof/>
                 <w:webHidden/>
               </w:rPr>
-              <w:t>22</w:t>
+              <w:t>24</w:t>
             </w:r>
             <w:r>
               <w:rPr>
@@ -2379,7 +3105,7 @@
               <w:lang w:eastAsia="en-GB" w:bidi="ar-SA"/>
             </w:rPr>
           </w:pPr>
-          <w:hyperlink w:anchor="_Toc203364743" w:history="1">
+          <w:hyperlink w:anchor="_Toc203870384" w:history="1">
             <w:r>
               <w:rPr>
                 <w:rStyle w:val="Hyperlink"/>
@@ -2406,7 +3132,7 @@
                 <w:noProof/>
                 <w:webHidden/>
               </w:rPr>
-              <w:instrText xml:space="preserve"> PAGEREF _Toc203364743 \h </w:instrText>
+              <w:instrText xml:space="preserve"> PAGEREF _Toc203870384 \h </w:instrText>
             </w:r>
             <w:r>
               <w:rPr>
@@ -2426,7 +3152,7 @@
                 <w:noProof/>
                 <w:webHidden/>
               </w:rPr>
-              <w:t>23</w:t>
+              <w:t>25</w:t>
             </w:r>
             <w:r>
               <w:rPr>
@@ -2461,7 +3187,6 @@
           <w:rFonts w:eastAsia="Times New Roman"/>
           <w:lang w:eastAsia="en-GB"/>
         </w:rPr>
-        <w:lastRenderedPageBreak/>
         <w:br w:type="page"/>
       </w:r>
     </w:p>
@@ -2477,7 +3202,1100 @@
           <w:lang w:eastAsia="en-GB"/>
         </w:rPr>
       </w:pPr>
-      <w:bookmarkStart w:id="0" w:name="_Toc203364712"/>
+      <w:bookmarkStart w:id="0" w:name="_Toc203870343"/>
+      <w:r>
+        <w:rPr>
+          <w:rFonts w:eastAsia="Times New Roman"/>
+          <w:lang w:eastAsia="en-GB"/>
+        </w:rPr>
+        <w:lastRenderedPageBreak/>
+        <w:t>Introduction</w:t>
+      </w:r>
+      <w:bookmarkEnd w:id="0"/>
+    </w:p>
+    <w:p>
+      <w:pPr>
+        <w:pStyle w:val="Heading2"/>
+        <w:rPr>
+          <w:lang w:eastAsia="en-GB"/>
+        </w:rPr>
+      </w:pPr>
+      <w:bookmarkStart w:id="1" w:name="_Toc203870344"/>
+      <w:r>
+        <w:rPr>
+          <w:lang w:eastAsia="en-GB"/>
+        </w:rPr>
+        <w:t>Environment variables</w:t>
+      </w:r>
+      <w:bookmarkEnd w:id="1"/>
+    </w:p>
+    <w:p>
+      <w:pPr>
+        <w:rPr>
+          <w:lang w:eastAsia="en-GB"/>
+        </w:rPr>
+      </w:pPr>
+      <w:r>
+        <w:rPr>
+          <w:lang w:eastAsia="en-GB"/>
+        </w:rPr>
+        <w:t xml:space="preserve">Environment variables are settings in your operating system that affect how processes (like Java programs) run. They help Java tools (like </w:t>
+      </w:r>
+      <w:proofErr w:type="spellStart"/>
+      <w:r>
+        <w:rPr>
+          <w:lang w:eastAsia="en-GB"/>
+        </w:rPr>
+        <w:t>javac</w:t>
+      </w:r>
+      <w:proofErr w:type="spellEnd"/>
+      <w:r>
+        <w:rPr>
+          <w:lang w:eastAsia="en-GB"/>
+        </w:rPr>
+        <w:t>, java) find the required files and libraries.</w:t>
+      </w:r>
+      <w:r>
+        <w:rPr>
+          <w:lang w:eastAsia="en-GB"/>
+        </w:rPr>
+        <w:t xml:space="preserve"> </w:t>
+      </w:r>
+      <w:r>
+        <w:rPr>
+          <w:lang w:eastAsia="en-GB"/>
+        </w:rPr>
+        <w:t>There are two types:</w:t>
+      </w:r>
+    </w:p>
+    <w:p>
+      <w:pPr>
+        <w:rPr>
+          <w:lang w:eastAsia="en-GB"/>
+        </w:rPr>
+      </w:pPr>
+    </w:p>
+    <w:p>
+      <w:pPr>
+        <w:pStyle w:val="Heading2"/>
+        <w:rPr>
+          <w:lang w:eastAsia="en-GB"/>
+        </w:rPr>
+      </w:pPr>
+      <w:bookmarkStart w:id="2" w:name="_Toc203870345"/>
+      <w:r>
+        <w:rPr>
+          <w:lang w:eastAsia="en-GB"/>
+        </w:rPr>
+        <w:t>User Variables:</w:t>
+      </w:r>
+      <w:bookmarkEnd w:id="2"/>
+    </w:p>
+    <w:p>
+      <w:pPr>
+        <w:pStyle w:val="ListParagraph"/>
+        <w:numPr>
+          <w:ilvl w:val="0"/>
+          <w:numId w:val="39"/>
+        </w:numPr>
+        <w:rPr>
+          <w:lang w:eastAsia="en-GB"/>
+        </w:rPr>
+      </w:pPr>
+      <w:r>
+        <w:rPr>
+          <w:lang w:eastAsia="en-GB"/>
+        </w:rPr>
+        <w:t>Specific to the currently logged-in user.</w:t>
+      </w:r>
+    </w:p>
+    <w:p>
+      <w:pPr>
+        <w:pStyle w:val="ListParagraph"/>
+        <w:numPr>
+          <w:ilvl w:val="0"/>
+          <w:numId w:val="39"/>
+        </w:numPr>
+        <w:rPr>
+          <w:lang w:eastAsia="en-GB"/>
+        </w:rPr>
+      </w:pPr>
+      <w:r>
+        <w:rPr>
+          <w:lang w:eastAsia="en-GB"/>
+        </w:rPr>
+        <w:t>Set by the user, not shared with other accounts.</w:t>
+      </w:r>
+    </w:p>
+    <w:p>
+      <w:pPr>
+        <w:pStyle w:val="ListParagraph"/>
+        <w:numPr>
+          <w:ilvl w:val="0"/>
+          <w:numId w:val="39"/>
+        </w:numPr>
+        <w:rPr>
+          <w:lang w:eastAsia="en-GB"/>
+        </w:rPr>
+      </w:pPr>
+      <w:r>
+        <w:rPr>
+          <w:b/>
+          <w:lang w:eastAsia="en-GB"/>
+        </w:rPr>
+        <w:t>Example</w:t>
+      </w:r>
+      <w:r>
+        <w:rPr>
+          <w:lang w:eastAsia="en-GB"/>
+        </w:rPr>
+        <w:t>: You set JAVA_HOME only for your account.</w:t>
+      </w:r>
+    </w:p>
+    <w:p>
+      <w:pPr>
+        <w:pStyle w:val="Heading2"/>
+        <w:rPr>
+          <w:lang w:eastAsia="en-GB"/>
+        </w:rPr>
+      </w:pPr>
+      <w:bookmarkStart w:id="3" w:name="_Toc203870346"/>
+      <w:r>
+        <w:rPr>
+          <w:lang w:eastAsia="en-GB"/>
+        </w:rPr>
+        <w:t>System Variables:</w:t>
+      </w:r>
+      <w:bookmarkEnd w:id="3"/>
+    </w:p>
+    <w:p>
+      <w:pPr>
+        <w:pStyle w:val="ListParagraph"/>
+        <w:numPr>
+          <w:ilvl w:val="0"/>
+          <w:numId w:val="39"/>
+        </w:numPr>
+        <w:rPr>
+          <w:lang w:eastAsia="en-GB"/>
+        </w:rPr>
+      </w:pPr>
+      <w:r>
+        <w:rPr>
+          <w:lang w:eastAsia="en-GB"/>
+        </w:rPr>
+        <w:t>Global – apply to all users on the system.</w:t>
+      </w:r>
+    </w:p>
+    <w:p>
+      <w:pPr>
+        <w:pStyle w:val="ListParagraph"/>
+        <w:numPr>
+          <w:ilvl w:val="0"/>
+          <w:numId w:val="39"/>
+        </w:numPr>
+        <w:rPr>
+          <w:lang w:eastAsia="en-GB"/>
+        </w:rPr>
+      </w:pPr>
+      <w:r>
+        <w:rPr>
+          <w:lang w:eastAsia="en-GB"/>
+        </w:rPr>
+        <w:t>Needs administrator privileges to modify.</w:t>
+      </w:r>
+    </w:p>
+    <w:p>
+      <w:pPr>
+        <w:pStyle w:val="ListParagraph"/>
+        <w:numPr>
+          <w:ilvl w:val="0"/>
+          <w:numId w:val="39"/>
+        </w:numPr>
+        <w:rPr>
+          <w:lang w:eastAsia="en-GB"/>
+        </w:rPr>
+      </w:pPr>
+      <w:r>
+        <w:rPr>
+          <w:b/>
+          <w:lang w:eastAsia="en-GB"/>
+        </w:rPr>
+        <w:t>Example</w:t>
+      </w:r>
+      <w:r>
+        <w:rPr>
+          <w:lang w:eastAsia="en-GB"/>
+        </w:rPr>
+        <w:t xml:space="preserve">: PATH, which helps the system locate Java tools like java, </w:t>
+      </w:r>
+      <w:proofErr w:type="spellStart"/>
+      <w:r>
+        <w:rPr>
+          <w:lang w:eastAsia="en-GB"/>
+        </w:rPr>
+        <w:t>javac</w:t>
+      </w:r>
+      <w:proofErr w:type="spellEnd"/>
+      <w:r>
+        <w:rPr>
+          <w:lang w:eastAsia="en-GB"/>
+        </w:rPr>
+        <w:t>.</w:t>
+      </w:r>
+    </w:p>
+    <w:p>
+      <w:pPr>
+        <w:rPr>
+          <w:lang w:eastAsia="en-GB"/>
+        </w:rPr>
+      </w:pPr>
+    </w:p>
+    <w:p>
+      <w:pPr>
+        <w:pStyle w:val="Heading2"/>
+        <w:rPr>
+          <w:lang w:eastAsia="en-GB"/>
+        </w:rPr>
+      </w:pPr>
+      <w:bookmarkStart w:id="4" w:name="_Toc203870347"/>
+      <w:r>
+        <w:rPr>
+          <w:lang w:eastAsia="en-GB"/>
+        </w:rPr>
+        <w:t>Where to Set Environment Variables</w:t>
+      </w:r>
+      <w:bookmarkEnd w:id="4"/>
+    </w:p>
+    <w:p>
+      <w:pPr>
+        <w:rPr>
+          <w:b/>
+          <w:lang w:eastAsia="en-GB"/>
+        </w:rPr>
+      </w:pPr>
+      <w:r>
+        <w:rPr>
+          <w:b/>
+          <w:lang w:eastAsia="en-GB"/>
+        </w:rPr>
+        <w:t>User Variables:</w:t>
+      </w:r>
+    </w:p>
+    <w:p>
+      <w:pPr>
+        <w:ind w:firstLine="720"/>
+        <w:rPr>
+          <w:lang w:eastAsia="en-GB"/>
+        </w:rPr>
+      </w:pPr>
+      <w:r>
+        <w:rPr>
+          <w:lang w:eastAsia="en-GB"/>
+        </w:rPr>
+        <w:t>Control Panel → System → Advanced system settings → Environment Variables → "User variables"</w:t>
+      </w:r>
+    </w:p>
+    <w:p>
+      <w:pPr>
+        <w:rPr>
+          <w:b/>
+          <w:lang w:eastAsia="en-GB"/>
+        </w:rPr>
+      </w:pPr>
+      <w:r>
+        <w:rPr>
+          <w:b/>
+          <w:lang w:eastAsia="en-GB"/>
+        </w:rPr>
+        <w:t>System Variables:</w:t>
+      </w:r>
+    </w:p>
+    <w:p>
+      <w:pPr>
+        <w:ind w:firstLine="720"/>
+        <w:rPr>
+          <w:lang w:eastAsia="en-GB"/>
+        </w:rPr>
+      </w:pPr>
+      <w:r>
+        <w:rPr>
+          <w:lang w:eastAsia="en-GB"/>
+        </w:rPr>
+        <w:t>Same place, under "System variables"</w:t>
+      </w:r>
+    </w:p>
+    <w:p>
+      <w:pPr>
+        <w:rPr>
+          <w:lang w:eastAsia="en-GB"/>
+        </w:rPr>
+      </w:pPr>
+    </w:p>
+    <w:p>
+      <w:pPr>
+        <w:pStyle w:val="Heading2"/>
+        <w:rPr>
+          <w:lang w:eastAsia="en-GB"/>
+        </w:rPr>
+      </w:pPr>
+      <w:bookmarkStart w:id="5" w:name="_Toc203870348"/>
+      <w:r>
+        <w:rPr>
+          <w:lang w:eastAsia="en-GB"/>
+        </w:rPr>
+        <w:t>Important Java Environment Variables</w:t>
+      </w:r>
+      <w:bookmarkEnd w:id="5"/>
+    </w:p>
+    <w:p>
+      <w:pPr>
+        <w:pStyle w:val="Heading3"/>
+      </w:pPr>
+      <w:bookmarkStart w:id="6" w:name="_Toc203870349"/>
+      <w:r>
+        <w:t>JAVA_HOME</w:t>
+      </w:r>
+      <w:bookmarkEnd w:id="6"/>
+    </w:p>
+    <w:p>
+      <w:pPr>
+        <w:pStyle w:val="ListParagraph"/>
+        <w:numPr>
+          <w:ilvl w:val="0"/>
+          <w:numId w:val="39"/>
+        </w:numPr>
+        <w:rPr>
+          <w:lang w:eastAsia="en-GB"/>
+        </w:rPr>
+      </w:pPr>
+      <w:r>
+        <w:rPr>
+          <w:lang w:eastAsia="en-GB"/>
+        </w:rPr>
+        <w:t>Points to the Java installation directory.</w:t>
+      </w:r>
+    </w:p>
+    <w:p>
+      <w:pPr>
+        <w:pStyle w:val="ListParagraph"/>
+        <w:numPr>
+          <w:ilvl w:val="0"/>
+          <w:numId w:val="39"/>
+        </w:numPr>
+        <w:rPr>
+          <w:lang w:eastAsia="en-GB"/>
+        </w:rPr>
+      </w:pPr>
+      <w:r>
+        <w:rPr>
+          <w:lang w:eastAsia="en-GB"/>
+        </w:rPr>
+        <w:t xml:space="preserve">Used by tools like Maven, </w:t>
+      </w:r>
+      <w:proofErr w:type="spellStart"/>
+      <w:r>
+        <w:rPr>
+          <w:lang w:eastAsia="en-GB"/>
+        </w:rPr>
+        <w:t>Gradle</w:t>
+      </w:r>
+      <w:proofErr w:type="spellEnd"/>
+      <w:r>
+        <w:rPr>
+          <w:lang w:eastAsia="en-GB"/>
+        </w:rPr>
+        <w:t xml:space="preserve">, Eclipse, </w:t>
+      </w:r>
+      <w:proofErr w:type="spellStart"/>
+      <w:r>
+        <w:rPr>
+          <w:lang w:eastAsia="en-GB"/>
+        </w:rPr>
+        <w:t>IntelliJ</w:t>
+      </w:r>
+      <w:proofErr w:type="spellEnd"/>
+      <w:r>
+        <w:rPr>
+          <w:lang w:eastAsia="en-GB"/>
+        </w:rPr>
+        <w:t>, etc.</w:t>
+      </w:r>
+    </w:p>
+    <w:p>
+      <w:pPr>
+        <w:pStyle w:val="ListParagraph"/>
+        <w:numPr>
+          <w:ilvl w:val="0"/>
+          <w:numId w:val="39"/>
+        </w:numPr>
+        <w:rPr>
+          <w:lang w:eastAsia="en-GB"/>
+        </w:rPr>
+      </w:pPr>
+      <w:r>
+        <w:rPr>
+          <w:b/>
+          <w:lang w:eastAsia="en-GB"/>
+        </w:rPr>
+        <w:t>Example</w:t>
+      </w:r>
+      <w:r>
+        <w:rPr>
+          <w:lang w:eastAsia="en-GB"/>
+        </w:rPr>
+        <w:t xml:space="preserve">: </w:t>
+      </w:r>
+      <w:r>
+        <w:rPr>
+          <w:lang w:eastAsia="en-GB"/>
+        </w:rPr>
+        <w:t>JAVA_HOME = C:\Program Files\Java\jdk-21</w:t>
+      </w:r>
+    </w:p>
+    <w:p>
+      <w:pPr>
+        <w:pStyle w:val="Heading3"/>
+      </w:pPr>
+      <w:bookmarkStart w:id="7" w:name="_Toc203870350"/>
+      <w:r>
+        <w:t>PATH</w:t>
+      </w:r>
+      <w:bookmarkEnd w:id="7"/>
+    </w:p>
+    <w:p>
+      <w:pPr>
+        <w:pStyle w:val="ListParagraph"/>
+        <w:numPr>
+          <w:ilvl w:val="0"/>
+          <w:numId w:val="39"/>
+        </w:numPr>
+        <w:rPr>
+          <w:lang w:eastAsia="en-GB"/>
+        </w:rPr>
+      </w:pPr>
+      <w:r>
+        <w:rPr>
+          <w:lang w:eastAsia="en-GB"/>
+        </w:rPr>
+        <w:t xml:space="preserve">Tells the system where to look for executable files like java and </w:t>
+      </w:r>
+      <w:proofErr w:type="spellStart"/>
+      <w:r>
+        <w:rPr>
+          <w:lang w:eastAsia="en-GB"/>
+        </w:rPr>
+        <w:t>javac.</w:t>
+      </w:r>
+      <w:proofErr w:type="spellEnd"/>
+    </w:p>
+    <w:p>
+      <w:pPr>
+        <w:pStyle w:val="ListParagraph"/>
+        <w:numPr>
+          <w:ilvl w:val="0"/>
+          <w:numId w:val="39"/>
+        </w:numPr>
+        <w:rPr>
+          <w:lang w:eastAsia="en-GB"/>
+        </w:rPr>
+      </w:pPr>
+      <w:r>
+        <w:rPr>
+          <w:lang w:eastAsia="en-GB"/>
+        </w:rPr>
+        <w:t>You add %JAVA_HOME%\bin to PATH so you can run Java commands in any folder.</w:t>
+      </w:r>
+    </w:p>
+    <w:p>
+      <w:pPr>
+        <w:pStyle w:val="ListParagraph"/>
+        <w:numPr>
+          <w:ilvl w:val="0"/>
+          <w:numId w:val="39"/>
+        </w:numPr>
+        <w:rPr>
+          <w:lang w:eastAsia="en-GB"/>
+        </w:rPr>
+      </w:pPr>
+      <w:r>
+        <w:rPr>
+          <w:b/>
+          <w:lang w:eastAsia="en-GB"/>
+        </w:rPr>
+        <w:t>Example</w:t>
+      </w:r>
+      <w:r>
+        <w:rPr>
+          <w:lang w:eastAsia="en-GB"/>
+        </w:rPr>
+        <w:t xml:space="preserve">: </w:t>
+      </w:r>
+      <w:r>
+        <w:rPr>
+          <w:lang w:eastAsia="en-GB"/>
+        </w:rPr>
+        <w:t>PATH = ...;C:\Program Files\Java\jdk-21\bin</w:t>
+      </w:r>
+    </w:p>
+    <w:p>
+      <w:pPr>
+        <w:pStyle w:val="Heading3"/>
+      </w:pPr>
+      <w:bookmarkStart w:id="8" w:name="_Toc203870351"/>
+      <w:r>
+        <w:t>CLASSPATH</w:t>
+      </w:r>
+      <w:bookmarkEnd w:id="8"/>
+    </w:p>
+    <w:p>
+      <w:pPr>
+        <w:pStyle w:val="ListParagraph"/>
+        <w:numPr>
+          <w:ilvl w:val="0"/>
+          <w:numId w:val="39"/>
+        </w:numPr>
+        <w:rPr>
+          <w:lang w:eastAsia="en-GB"/>
+        </w:rPr>
+      </w:pPr>
+      <w:r>
+        <w:rPr>
+          <w:lang w:eastAsia="en-GB"/>
+        </w:rPr>
+        <w:t>Tells the Java compiler (</w:t>
+      </w:r>
+      <w:proofErr w:type="spellStart"/>
+      <w:r>
+        <w:rPr>
+          <w:lang w:eastAsia="en-GB"/>
+        </w:rPr>
+        <w:t>javac</w:t>
+      </w:r>
+      <w:proofErr w:type="spellEnd"/>
+      <w:r>
+        <w:rPr>
+          <w:lang w:eastAsia="en-GB"/>
+        </w:rPr>
+        <w:t>) and JVM (java) where to find user-defined classes and packages.</w:t>
+      </w:r>
+    </w:p>
+    <w:p>
+      <w:pPr>
+        <w:pStyle w:val="ListParagraph"/>
+        <w:numPr>
+          <w:ilvl w:val="0"/>
+          <w:numId w:val="39"/>
+        </w:numPr>
+        <w:rPr>
+          <w:lang w:eastAsia="en-GB"/>
+        </w:rPr>
+      </w:pPr>
+      <w:r>
+        <w:rPr>
+          <w:lang w:eastAsia="en-GB"/>
+        </w:rPr>
+        <w:t>Not always needed. It's used when your Java program depends on</w:t>
+      </w:r>
+      <w:r>
+        <w:rPr>
+          <w:lang w:eastAsia="en-GB"/>
+        </w:rPr>
+        <w:t xml:space="preserve"> </w:t>
+      </w:r>
+      <w:r>
+        <w:rPr>
+          <w:lang w:eastAsia="en-GB"/>
+        </w:rPr>
+        <w:t xml:space="preserve">External .jar files (like </w:t>
+      </w:r>
+      <w:proofErr w:type="spellStart"/>
+      <w:r>
+        <w:rPr>
+          <w:lang w:eastAsia="en-GB"/>
+        </w:rPr>
+        <w:t>MySQL</w:t>
+      </w:r>
+      <w:proofErr w:type="spellEnd"/>
+      <w:r>
+        <w:rPr>
+          <w:lang w:eastAsia="en-GB"/>
+        </w:rPr>
+        <w:t xml:space="preserve"> Connector, Apache POI, etc.)</w:t>
+      </w:r>
+      <w:r>
+        <w:rPr>
+          <w:lang w:eastAsia="en-GB"/>
+        </w:rPr>
+        <w:t xml:space="preserve">, </w:t>
+      </w:r>
+      <w:r>
+        <w:rPr>
+          <w:lang w:eastAsia="en-GB"/>
+        </w:rPr>
+        <w:t>Custom class locations.</w:t>
+      </w:r>
+    </w:p>
+    <w:p>
+      <w:pPr>
+        <w:pStyle w:val="ListParagraph"/>
+        <w:numPr>
+          <w:ilvl w:val="0"/>
+          <w:numId w:val="39"/>
+        </w:numPr>
+        <w:rPr>
+          <w:lang w:eastAsia="en-GB"/>
+        </w:rPr>
+      </w:pPr>
+      <w:r>
+        <w:rPr>
+          <w:b/>
+          <w:lang w:eastAsia="en-GB"/>
+        </w:rPr>
+        <w:t>Example</w:t>
+      </w:r>
+      <w:r>
+        <w:rPr>
+          <w:lang w:eastAsia="en-GB"/>
+        </w:rPr>
+        <w:t xml:space="preserve">: </w:t>
+      </w:r>
+      <w:r>
+        <w:rPr>
+          <w:lang w:eastAsia="en-GB"/>
+        </w:rPr>
+        <w:t>CLASSPATH = .;C:\MyJavaLibs\mysql-connector.jar</w:t>
+      </w:r>
+      <w:r>
+        <w:rPr>
+          <w:lang w:eastAsia="en-GB"/>
+        </w:rPr>
+        <w:t xml:space="preserve"> </w:t>
+      </w:r>
+      <w:r>
+        <w:rPr>
+          <w:lang w:eastAsia="en-GB"/>
+        </w:rPr>
+        <w:t>(. means current directory is included)</w:t>
+      </w:r>
+    </w:p>
+    <w:p>
+      <w:pPr>
+        <w:pStyle w:val="Heading2"/>
+        <w:rPr>
+          <w:lang w:eastAsia="en-GB"/>
+        </w:rPr>
+      </w:pPr>
+      <w:bookmarkStart w:id="9" w:name="_Toc203870352"/>
+      <w:r>
+        <w:rPr>
+          <w:lang w:eastAsia="en-GB"/>
+        </w:rPr>
+        <w:lastRenderedPageBreak/>
+        <w:t>Examples</w:t>
+      </w:r>
+      <w:bookmarkEnd w:id="9"/>
+    </w:p>
+    <w:p>
+      <w:pPr>
+        <w:rPr>
+          <w:lang w:eastAsia="en-GB"/>
+        </w:rPr>
+      </w:pPr>
+    </w:p>
+    <w:p>
+      <w:pPr>
+        <w:rPr>
+          <w:b/>
+          <w:lang w:eastAsia="en-GB"/>
+        </w:rPr>
+      </w:pPr>
+      <w:r>
+        <w:rPr>
+          <w:b/>
+          <w:lang w:eastAsia="en-GB"/>
+        </w:rPr>
+        <w:t>Example 01</w:t>
+      </w:r>
+    </w:p>
+    <w:tbl>
+      <w:tblPr>
+        <w:tblStyle w:val="TableGrid"/>
+        <w:tblW w:w="0" w:type="auto"/>
+        <w:tblInd w:w="720" w:type="dxa"/>
+        <w:tblLook w:val="04A0"/>
+      </w:tblPr>
+      <w:tblGrid>
+        <w:gridCol w:w="9560"/>
+      </w:tblGrid>
+      <w:tr>
+        <w:tc>
+          <w:tcPr>
+            <w:tcW w:w="10280" w:type="dxa"/>
+          </w:tcPr>
+          <w:p>
+            <w:pPr>
+              <w:rPr>
+                <w:b/>
+                <w:lang w:eastAsia="en-GB"/>
+              </w:rPr>
+            </w:pPr>
+            <w:r>
+              <w:rPr>
+                <w:b/>
+                <w:lang w:eastAsia="en-GB"/>
+              </w:rPr>
+              <w:t>Running Java Without Setting PATH</w:t>
+            </w:r>
+          </w:p>
+          <w:p>
+            <w:pPr>
+              <w:rPr>
+                <w:lang w:eastAsia="en-GB"/>
+              </w:rPr>
+            </w:pPr>
+            <w:r>
+              <w:rPr>
+                <w:lang w:eastAsia="en-GB"/>
+              </w:rPr>
+              <w:t xml:space="preserve">&gt; </w:t>
+            </w:r>
+            <w:proofErr w:type="spellStart"/>
+            <w:r>
+              <w:rPr>
+                <w:lang w:eastAsia="en-GB"/>
+              </w:rPr>
+              <w:t>javac</w:t>
+            </w:r>
+            <w:proofErr w:type="spellEnd"/>
+            <w:r>
+              <w:rPr>
+                <w:lang w:eastAsia="en-GB"/>
+              </w:rPr>
+              <w:t xml:space="preserve"> Hello.java</w:t>
+            </w:r>
+          </w:p>
+          <w:p>
+            <w:pPr>
+              <w:rPr>
+                <w:lang w:eastAsia="en-GB"/>
+              </w:rPr>
+            </w:pPr>
+            <w:r>
+              <w:rPr>
+                <w:lang w:eastAsia="en-GB"/>
+              </w:rPr>
+              <w:t>'</w:t>
+            </w:r>
+            <w:proofErr w:type="spellStart"/>
+            <w:proofErr w:type="gramStart"/>
+            <w:r>
+              <w:rPr>
+                <w:lang w:eastAsia="en-GB"/>
+              </w:rPr>
+              <w:t>javac</w:t>
+            </w:r>
+            <w:proofErr w:type="spellEnd"/>
+            <w:proofErr w:type="gramEnd"/>
+            <w:r>
+              <w:rPr>
+                <w:lang w:eastAsia="en-GB"/>
+              </w:rPr>
+              <w:t>' is not recognized as an internal or external command.</w:t>
+            </w:r>
+          </w:p>
+          <w:p>
+            <w:pPr>
+              <w:rPr>
+                <w:lang w:eastAsia="en-GB"/>
+              </w:rPr>
+            </w:pPr>
+          </w:p>
+          <w:p>
+            <w:pPr>
+              <w:rPr>
+                <w:b/>
+                <w:lang w:eastAsia="en-GB"/>
+              </w:rPr>
+            </w:pPr>
+            <w:r>
+              <w:rPr>
+                <w:b/>
+                <w:lang w:eastAsia="en-GB"/>
+              </w:rPr>
+              <w:t xml:space="preserve"> After adding Java's bin directory to PATH, it works:</w:t>
+            </w:r>
+          </w:p>
+          <w:p>
+            <w:pPr>
+              <w:rPr>
+                <w:lang w:eastAsia="en-GB"/>
+              </w:rPr>
+            </w:pPr>
+            <w:r>
+              <w:rPr>
+                <w:lang w:eastAsia="en-GB"/>
+              </w:rPr>
+              <w:t xml:space="preserve">&gt; </w:t>
+            </w:r>
+            <w:proofErr w:type="spellStart"/>
+            <w:r>
+              <w:rPr>
+                <w:lang w:eastAsia="en-GB"/>
+              </w:rPr>
+              <w:t>javac</w:t>
+            </w:r>
+            <w:proofErr w:type="spellEnd"/>
+            <w:r>
+              <w:rPr>
+                <w:lang w:eastAsia="en-GB"/>
+              </w:rPr>
+              <w:t xml:space="preserve"> Hello.java</w:t>
+            </w:r>
+          </w:p>
+          <w:p>
+            <w:pPr>
+              <w:pStyle w:val="ListParagraph"/>
+              <w:ind w:left="0"/>
+              <w:rPr>
+                <w:lang w:eastAsia="en-GB"/>
+              </w:rPr>
+            </w:pPr>
+            <w:r>
+              <w:rPr>
+                <w:lang w:eastAsia="en-GB"/>
+              </w:rPr>
+              <w:t>&gt; java Hello</w:t>
+            </w:r>
+          </w:p>
+        </w:tc>
+      </w:tr>
+    </w:tbl>
+    <w:p>
+      <w:pPr>
+        <w:pStyle w:val="ListParagraph"/>
+        <w:rPr>
+          <w:lang w:eastAsia="en-GB"/>
+        </w:rPr>
+      </w:pPr>
+    </w:p>
+    <w:p>
+      <w:pPr>
+        <w:rPr>
+          <w:b/>
+          <w:lang w:eastAsia="en-GB"/>
+        </w:rPr>
+      </w:pPr>
+      <w:r>
+        <w:rPr>
+          <w:b/>
+          <w:lang w:eastAsia="en-GB"/>
+        </w:rPr>
+        <w:t>Example 02</w:t>
+      </w:r>
+    </w:p>
+    <w:tbl>
+      <w:tblPr>
+        <w:tblStyle w:val="TableGrid"/>
+        <w:tblW w:w="0" w:type="auto"/>
+        <w:tblInd w:w="720" w:type="dxa"/>
+        <w:tblLook w:val="04A0"/>
+      </w:tblPr>
+      <w:tblGrid>
+        <w:gridCol w:w="9560"/>
+      </w:tblGrid>
+      <w:tr>
+        <w:tc>
+          <w:tcPr>
+            <w:tcW w:w="10280" w:type="dxa"/>
+          </w:tcPr>
+          <w:p>
+            <w:pPr>
+              <w:rPr>
+                <w:b/>
+                <w:lang w:eastAsia="en-GB"/>
+              </w:rPr>
+            </w:pPr>
+            <w:r>
+              <w:rPr>
+                <w:b/>
+                <w:lang w:eastAsia="en-GB"/>
+              </w:rPr>
+              <w:t>Using a JAR Library</w:t>
+            </w:r>
+          </w:p>
+          <w:p>
+            <w:pPr>
+              <w:rPr>
+                <w:lang w:eastAsia="en-GB"/>
+              </w:rPr>
+            </w:pPr>
+            <w:r>
+              <w:rPr>
+                <w:lang w:eastAsia="en-GB"/>
+              </w:rPr>
+              <w:t>You have:</w:t>
+            </w:r>
+          </w:p>
+          <w:p>
+            <w:pPr>
+              <w:rPr>
+                <w:lang w:eastAsia="en-GB"/>
+              </w:rPr>
+            </w:pPr>
+            <w:r>
+              <w:rPr>
+                <w:lang w:eastAsia="en-GB"/>
+              </w:rPr>
+              <w:t xml:space="preserve">    mysql-connector.jar</w:t>
+            </w:r>
+          </w:p>
+          <w:p>
+            <w:pPr>
+              <w:rPr>
+                <w:lang w:eastAsia="en-GB"/>
+              </w:rPr>
+            </w:pPr>
+            <w:r>
+              <w:rPr>
+                <w:lang w:eastAsia="en-GB"/>
+              </w:rPr>
+              <w:t xml:space="preserve">    Your program: DBConnect.java</w:t>
+            </w:r>
+          </w:p>
+          <w:p>
+            <w:pPr>
+              <w:rPr>
+                <w:lang w:eastAsia="en-GB"/>
+              </w:rPr>
+            </w:pPr>
+          </w:p>
+          <w:p>
+            <w:pPr>
+              <w:rPr>
+                <w:b/>
+                <w:lang w:eastAsia="en-GB"/>
+              </w:rPr>
+            </w:pPr>
+            <w:r>
+              <w:rPr>
+                <w:b/>
+                <w:lang w:eastAsia="en-GB"/>
+              </w:rPr>
+              <w:t>Set CLASSPATH temporarily:</w:t>
+            </w:r>
+          </w:p>
+          <w:p>
+            <w:pPr>
+              <w:rPr>
+                <w:lang w:eastAsia="en-GB"/>
+              </w:rPr>
+            </w:pPr>
+            <w:r>
+              <w:rPr>
+                <w:lang w:eastAsia="en-GB"/>
+              </w:rPr>
+              <w:t>&gt; set CLASSPATH=.;C:\MyLibs\mysql-connector.jar</w:t>
+            </w:r>
+          </w:p>
+          <w:p>
+            <w:pPr>
+              <w:rPr>
+                <w:lang w:eastAsia="en-GB"/>
+              </w:rPr>
+            </w:pPr>
+            <w:r>
+              <w:rPr>
+                <w:lang w:eastAsia="en-GB"/>
+              </w:rPr>
+              <w:t xml:space="preserve">&gt; </w:t>
+            </w:r>
+            <w:proofErr w:type="spellStart"/>
+            <w:r>
+              <w:rPr>
+                <w:lang w:eastAsia="en-GB"/>
+              </w:rPr>
+              <w:t>javac</w:t>
+            </w:r>
+            <w:proofErr w:type="spellEnd"/>
+            <w:r>
+              <w:rPr>
+                <w:lang w:eastAsia="en-GB"/>
+              </w:rPr>
+              <w:t xml:space="preserve"> DBConnect.java</w:t>
+            </w:r>
+          </w:p>
+          <w:p>
+            <w:pPr>
+              <w:pStyle w:val="ListParagraph"/>
+              <w:ind w:left="0"/>
+              <w:rPr>
+                <w:lang w:eastAsia="en-GB"/>
+              </w:rPr>
+            </w:pPr>
+            <w:r>
+              <w:rPr>
+                <w:lang w:eastAsia="en-GB"/>
+              </w:rPr>
+              <w:t xml:space="preserve">&gt; java </w:t>
+            </w:r>
+            <w:proofErr w:type="spellStart"/>
+            <w:r>
+              <w:rPr>
+                <w:lang w:eastAsia="en-GB"/>
+              </w:rPr>
+              <w:t>DBConnect</w:t>
+            </w:r>
+            <w:proofErr w:type="spellEnd"/>
+          </w:p>
+        </w:tc>
+      </w:tr>
+    </w:tbl>
+    <w:p>
+      <w:pPr>
+        <w:rPr>
+          <w:rFonts w:asciiTheme="majorHAnsi" w:eastAsia="Times New Roman" w:hAnsiTheme="majorHAnsi" w:cstheme="majorBidi"/>
+          <w:b/>
+          <w:bCs/>
+          <w:color w:val="365F91" w:themeColor="accent1" w:themeShade="BF"/>
+          <w:sz w:val="28"/>
+          <w:szCs w:val="28"/>
+          <w:lang w:eastAsia="en-GB"/>
+        </w:rPr>
+      </w:pPr>
+    </w:p>
+    <w:p>
+      <w:pPr>
+        <w:rPr>
+          <w:rFonts w:asciiTheme="majorHAnsi" w:eastAsia="Times New Roman" w:hAnsiTheme="majorHAnsi" w:cstheme="majorBidi"/>
+          <w:b/>
+          <w:bCs/>
+          <w:color w:val="365F91" w:themeColor="accent1" w:themeShade="BF"/>
+          <w:sz w:val="28"/>
+          <w:szCs w:val="28"/>
+          <w:lang w:eastAsia="en-GB"/>
+        </w:rPr>
+      </w:pPr>
+      <w:r>
+        <w:rPr>
+          <w:rFonts w:eastAsia="Times New Roman"/>
+          <w:lang w:eastAsia="en-GB"/>
+        </w:rPr>
+        <w:br w:type="page"/>
+      </w:r>
+    </w:p>
+    <w:p>
+      <w:pPr>
+        <w:pStyle w:val="Heading1"/>
+        <w:numPr>
+          <w:ilvl w:val="0"/>
+          <w:numId w:val="34"/>
+        </w:numPr>
+        <w:rPr>
+          <w:rFonts w:eastAsia="Times New Roman"/>
+          <w:lang w:eastAsia="en-GB"/>
+        </w:rPr>
+      </w:pPr>
+      <w:bookmarkStart w:id="10" w:name="_Toc203870353"/>
       <w:r>
         <w:rPr>
           <w:rFonts w:eastAsia="Times New Roman"/>
@@ -2486,7 +4304,7 @@
         <w:lastRenderedPageBreak/>
         <w:t>Core OOP Principles (Pillars of OOP)</w:t>
       </w:r>
-      <w:bookmarkEnd w:id="0"/>
+      <w:bookmarkEnd w:id="10"/>
     </w:p>
     <w:p>
       <w:pPr>
@@ -2699,7 +4517,7 @@
       <w:pPr>
         <w:pStyle w:val="Heading2"/>
       </w:pPr>
-      <w:bookmarkStart w:id="1" w:name="_Toc203364713"/>
+      <w:bookmarkStart w:id="11" w:name="_Toc203870354"/>
       <w:r>
         <w:lastRenderedPageBreak/>
         <w:t xml:space="preserve">1. </w:t>
@@ -2712,7 +4530,7 @@
         </w:rPr>
         <w:t>Class</w:t>
       </w:r>
-      <w:bookmarkEnd w:id="1"/>
+      <w:bookmarkEnd w:id="11"/>
     </w:p>
     <w:p>
       <w:r>
@@ -2941,7 +4759,7 @@
       <w:pPr>
         <w:pStyle w:val="Heading2"/>
       </w:pPr>
-      <w:bookmarkStart w:id="2" w:name="_Toc203364714"/>
+      <w:bookmarkStart w:id="12" w:name="_Toc203870355"/>
       <w:r>
         <w:lastRenderedPageBreak/>
         <w:t xml:space="preserve">2. </w:t>
@@ -2954,7 +4772,7 @@
         </w:rPr>
         <w:t>Object</w:t>
       </w:r>
-      <w:bookmarkEnd w:id="2"/>
+      <w:bookmarkEnd w:id="12"/>
     </w:p>
     <w:p>
       <w:r>
@@ -3136,7 +4954,7 @@
       <w:pPr>
         <w:pStyle w:val="Heading2"/>
       </w:pPr>
-      <w:bookmarkStart w:id="3" w:name="_Toc203364715"/>
+      <w:bookmarkStart w:id="13" w:name="_Toc203870356"/>
       <w:r>
         <w:lastRenderedPageBreak/>
         <w:t xml:space="preserve">3. </w:t>
@@ -3149,7 +4967,7 @@
         </w:rPr>
         <w:t>Abstraction</w:t>
       </w:r>
-      <w:bookmarkEnd w:id="3"/>
+      <w:bookmarkEnd w:id="13"/>
     </w:p>
     <w:p>
       <w:r>
@@ -3349,7 +5167,7 @@
       <w:pPr>
         <w:pStyle w:val="Heading2"/>
       </w:pPr>
-      <w:bookmarkStart w:id="4" w:name="_Toc203364716"/>
+      <w:bookmarkStart w:id="14" w:name="_Toc203870357"/>
       <w:r>
         <w:lastRenderedPageBreak/>
         <w:t xml:space="preserve">4. </w:t>
@@ -3362,7 +5180,7 @@
         </w:rPr>
         <w:t>Encapsulation</w:t>
       </w:r>
-      <w:bookmarkEnd w:id="4"/>
+      <w:bookmarkEnd w:id="14"/>
     </w:p>
     <w:p>
       <w:r>
@@ -3573,7 +5391,7 @@
       <w:pPr>
         <w:pStyle w:val="Heading2"/>
       </w:pPr>
-      <w:bookmarkStart w:id="5" w:name="_Toc203364717"/>
+      <w:bookmarkStart w:id="15" w:name="_Toc203870358"/>
       <w:r>
         <w:lastRenderedPageBreak/>
         <w:t xml:space="preserve">5. </w:t>
@@ -3586,7 +5404,7 @@
         </w:rPr>
         <w:t>Inheritance</w:t>
       </w:r>
-      <w:bookmarkEnd w:id="5"/>
+      <w:bookmarkEnd w:id="15"/>
     </w:p>
     <w:p>
       <w:r>
@@ -3841,7 +5659,7 @@
       <w:pPr>
         <w:pStyle w:val="Heading2"/>
       </w:pPr>
-      <w:bookmarkStart w:id="6" w:name="_Toc203364718"/>
+      <w:bookmarkStart w:id="16" w:name="_Toc203870359"/>
       <w:r>
         <w:lastRenderedPageBreak/>
         <w:t xml:space="preserve">6. </w:t>
@@ -3854,7 +5672,7 @@
         </w:rPr>
         <w:t>Polymorphism</w:t>
       </w:r>
-      <w:bookmarkEnd w:id="6"/>
+      <w:bookmarkEnd w:id="16"/>
     </w:p>
     <w:p>
       <w:r>
@@ -3889,11 +5707,11 @@
       <w:pPr>
         <w:pStyle w:val="Heading3"/>
       </w:pPr>
-      <w:bookmarkStart w:id="7" w:name="_Toc203364719"/>
+      <w:bookmarkStart w:id="17" w:name="_Toc203870360"/>
       <w:r>
         <w:t>Compile-time Polymorphism (Method Overloading)</w:t>
       </w:r>
-      <w:bookmarkEnd w:id="7"/>
+      <w:bookmarkEnd w:id="17"/>
     </w:p>
     <w:p>
       <w:r>
@@ -4083,12 +5901,12 @@
       <w:pPr>
         <w:pStyle w:val="Heading3"/>
       </w:pPr>
-      <w:bookmarkStart w:id="8" w:name="_Toc203364720"/>
+      <w:bookmarkStart w:id="18" w:name="_Toc203870361"/>
       <w:r>
         <w:lastRenderedPageBreak/>
         <w:t>Runtime Polymorphism (Method Overriding)</w:t>
       </w:r>
-      <w:bookmarkEnd w:id="8"/>
+      <w:bookmarkEnd w:id="18"/>
     </w:p>
     <w:p>
       <w:r>
@@ -4377,7 +6195,7 @@
           <w:lang w:eastAsia="en-GB"/>
         </w:rPr>
       </w:pPr>
-      <w:bookmarkStart w:id="9" w:name="_Toc203364721"/>
+      <w:bookmarkStart w:id="19" w:name="_Toc203870362"/>
       <w:r>
         <w:rPr>
           <w:rFonts w:eastAsia="Times New Roman"/>
@@ -4386,7 +6204,7 @@
         <w:lastRenderedPageBreak/>
         <w:t>Java-Specific Implementation of OOP</w:t>
       </w:r>
-      <w:bookmarkEnd w:id="9"/>
+      <w:bookmarkEnd w:id="19"/>
     </w:p>
     <w:p>
       <w:pPr>
@@ -4673,7 +6491,7 @@
           <w:lang w:eastAsia="en-GB"/>
         </w:rPr>
       </w:pPr>
-      <w:bookmarkStart w:id="10" w:name="_Toc203364722"/>
+      <w:bookmarkStart w:id="20" w:name="_Toc203870363"/>
       <w:r>
         <w:rPr>
           <w:rFonts w:eastAsia="Times New Roman"/>
@@ -4681,7 +6499,7 @@
         </w:rPr>
         <w:t>Inheritance in Java</w:t>
       </w:r>
-      <w:bookmarkEnd w:id="10"/>
+      <w:bookmarkEnd w:id="20"/>
     </w:p>
     <w:p>
       <w:pPr>
@@ -4845,7 +6663,7 @@
           <w:lang w:eastAsia="en-GB"/>
         </w:rPr>
       </w:pPr>
-      <w:bookmarkStart w:id="11" w:name="_Toc203364723"/>
+      <w:bookmarkStart w:id="21" w:name="_Toc203870364"/>
       <w:r>
         <w:rPr>
           <w:rFonts w:eastAsia="Times New Roman"/>
@@ -4853,7 +6671,7 @@
         </w:rPr>
         <w:t>Polymorphism in Java</w:t>
       </w:r>
-      <w:bookmarkEnd w:id="11"/>
+      <w:bookmarkEnd w:id="21"/>
     </w:p>
     <w:p>
       <w:pPr>
@@ -5070,7 +6888,7 @@
           <w:lang w:eastAsia="en-GB"/>
         </w:rPr>
       </w:pPr>
-      <w:bookmarkStart w:id="12" w:name="_Toc203364724"/>
+      <w:bookmarkStart w:id="22" w:name="_Toc203870365"/>
       <w:r>
         <w:rPr>
           <w:rFonts w:eastAsia="Times New Roman"/>
@@ -5079,7 +6897,7 @@
         <w:lastRenderedPageBreak/>
         <w:t>Abstraction in Java</w:t>
       </w:r>
-      <w:bookmarkEnd w:id="12"/>
+      <w:bookmarkEnd w:id="22"/>
     </w:p>
     <w:p>
       <w:pPr>
@@ -5279,7 +7097,7 @@
           <w:lang w:eastAsia="en-GB"/>
         </w:rPr>
       </w:pPr>
-      <w:bookmarkStart w:id="13" w:name="_Toc203364725"/>
+      <w:bookmarkStart w:id="23" w:name="_Toc203870366"/>
       <w:r>
         <w:rPr>
           <w:rFonts w:eastAsia="Times New Roman"/>
@@ -5287,7 +7105,7 @@
         </w:rPr>
         <w:t>Encapsulation in Java</w:t>
       </w:r>
-      <w:bookmarkEnd w:id="13"/>
+      <w:bookmarkEnd w:id="23"/>
     </w:p>
     <w:p>
       <w:pPr>
@@ -5395,7 +7213,7 @@
           <w:lang w:eastAsia="en-GB"/>
         </w:rPr>
       </w:pPr>
-      <w:bookmarkStart w:id="14" w:name="_Toc203364726"/>
+      <w:bookmarkStart w:id="24" w:name="_Toc203870367"/>
       <w:r>
         <w:rPr>
           <w:rFonts w:eastAsia="Times New Roman"/>
@@ -5403,7 +7221,7 @@
         </w:rPr>
         <w:t>Advanced OOP Features</w:t>
       </w:r>
-      <w:bookmarkEnd w:id="14"/>
+      <w:bookmarkEnd w:id="24"/>
     </w:p>
     <w:p>
       <w:pPr>
@@ -5689,7 +7507,7 @@
           <w:lang w:eastAsia="en-GB"/>
         </w:rPr>
       </w:pPr>
-      <w:bookmarkStart w:id="15" w:name="_Toc203364727"/>
+      <w:bookmarkStart w:id="25" w:name="_Toc203870368"/>
       <w:r>
         <w:rPr>
           <w:rFonts w:eastAsia="Times New Roman"/>
@@ -5697,7 +7515,7 @@
         </w:rPr>
         <w:t>OOP Design Concepts (For Deeper Understanding)</w:t>
       </w:r>
-      <w:bookmarkEnd w:id="15"/>
+      <w:bookmarkEnd w:id="25"/>
     </w:p>
     <w:p>
       <w:pPr>
@@ -5860,28 +7678,28 @@
       <w:pPr>
         <w:pStyle w:val="Heading1"/>
       </w:pPr>
-      <w:bookmarkStart w:id="16" w:name="_Toc203364728"/>
+      <w:bookmarkStart w:id="26" w:name="_Toc203870369"/>
       <w:r>
         <w:lastRenderedPageBreak/>
         <w:t>Questions</w:t>
       </w:r>
-      <w:bookmarkEnd w:id="16"/>
+      <w:bookmarkEnd w:id="26"/>
     </w:p>
     <w:p>
       <w:pPr>
         <w:pStyle w:val="Heading2"/>
       </w:pPr>
-      <w:bookmarkStart w:id="17" w:name="_Toc203364729"/>
+      <w:bookmarkStart w:id="27" w:name="_Toc203870370"/>
       <w:r>
         <w:t>Questions on Class</w:t>
       </w:r>
-      <w:bookmarkEnd w:id="17"/>
+      <w:bookmarkEnd w:id="27"/>
     </w:p>
     <w:p>
       <w:pPr>
         <w:pStyle w:val="Heading3"/>
       </w:pPr>
-      <w:bookmarkStart w:id="18" w:name="_Toc203364730"/>
+      <w:bookmarkStart w:id="28" w:name="_Toc203870371"/>
       <w:r>
         <w:t xml:space="preserve">Basic Conceptual Questions on Java </w:t>
       </w:r>
@@ -5893,7 +7711,7 @@
         </w:rPr>
         <w:t>Class</w:t>
       </w:r>
-      <w:bookmarkEnd w:id="18"/>
+      <w:bookmarkEnd w:id="28"/>
     </w:p>
     <w:p>
       <w:pPr>
@@ -7052,11 +8870,11 @@
       <w:pPr>
         <w:pStyle w:val="Heading3"/>
       </w:pPr>
-      <w:bookmarkStart w:id="19" w:name="_Toc203364731"/>
+      <w:bookmarkStart w:id="29" w:name="_Toc203870372"/>
       <w:r>
         <w:t>Class Members (Fields and Methods)</w:t>
       </w:r>
-      <w:bookmarkEnd w:id="19"/>
+      <w:bookmarkEnd w:id="29"/>
     </w:p>
     <w:p>
       <w:pPr>
@@ -7808,12 +9626,12 @@
       <w:pPr>
         <w:pStyle w:val="Heading3"/>
       </w:pPr>
-      <w:bookmarkStart w:id="20" w:name="_Toc203364732"/>
+      <w:bookmarkStart w:id="30" w:name="_Toc203870373"/>
       <w:r>
         <w:lastRenderedPageBreak/>
         <w:t>Types and Modifiers</w:t>
       </w:r>
-      <w:bookmarkEnd w:id="20"/>
+      <w:bookmarkEnd w:id="30"/>
     </w:p>
     <w:p>
       <w:pPr>
@@ -7918,9 +9736,12 @@
             </w:r>
             <w:proofErr w:type="spellStart"/>
             <w:r>
-              <w:t>subclassed.</w:t>
+              <w:t>subclassed</w:t>
             </w:r>
             <w:proofErr w:type="spellEnd"/>
+            <w:r>
+              <w:t>.</w:t>
+            </w:r>
           </w:p>
           <w:p>
             <w:pPr>
@@ -8630,7 +10451,7 @@
       <w:pPr>
         <w:pStyle w:val="Heading3"/>
       </w:pPr>
-      <w:bookmarkStart w:id="21" w:name="_Toc203364733"/>
+      <w:bookmarkStart w:id="31" w:name="_Toc203870374"/>
       <w:r>
         <w:lastRenderedPageBreak/>
         <w:t xml:space="preserve">Class </w:t>
@@ -8643,7 +10464,7 @@
       <w:r>
         <w:t xml:space="preserve"> Interface</w:t>
       </w:r>
-      <w:bookmarkEnd w:id="21"/>
+      <w:bookmarkEnd w:id="31"/>
     </w:p>
     <w:p>
       <w:pPr>
@@ -8776,11 +10597,11 @@
       <w:pPr>
         <w:pStyle w:val="Heading3"/>
       </w:pPr>
-      <w:bookmarkStart w:id="22" w:name="_Toc203364734"/>
+      <w:bookmarkStart w:id="32" w:name="_Toc203870375"/>
       <w:r>
         <w:t>Code-based &amp; Practical Questions</w:t>
       </w:r>
-      <w:bookmarkEnd w:id="22"/>
+      <w:bookmarkEnd w:id="32"/>
     </w:p>
     <w:p>
       <w:pPr>
@@ -9005,11 +10826,11 @@
       <w:pPr>
         <w:pStyle w:val="Heading3"/>
       </w:pPr>
-      <w:bookmarkStart w:id="23" w:name="_Toc203364735"/>
+      <w:bookmarkStart w:id="33" w:name="_Toc203870376"/>
       <w:r>
         <w:t>Memory and Design</w:t>
       </w:r>
-      <w:bookmarkEnd w:id="23"/>
+      <w:bookmarkEnd w:id="33"/>
     </w:p>
     <w:p>
       <w:pPr>
@@ -9142,11 +10963,11 @@
       <w:pPr>
         <w:pStyle w:val="Heading3"/>
       </w:pPr>
-      <w:bookmarkStart w:id="24" w:name="_Toc203364736"/>
+      <w:bookmarkStart w:id="34" w:name="_Toc203870377"/>
       <w:r>
         <w:t>Advanced</w:t>
       </w:r>
-      <w:bookmarkEnd w:id="24"/>
+      <w:bookmarkEnd w:id="34"/>
     </w:p>
     <w:p>
       <w:pPr>
@@ -9336,12 +11157,12 @@
       <w:pPr>
         <w:pStyle w:val="Heading2"/>
       </w:pPr>
-      <w:bookmarkStart w:id="25" w:name="_Toc203364737"/>
+      <w:bookmarkStart w:id="35" w:name="_Toc203870378"/>
       <w:r>
         <w:lastRenderedPageBreak/>
         <w:t>Questions on Object</w:t>
       </w:r>
-      <w:bookmarkEnd w:id="25"/>
+      <w:bookmarkEnd w:id="35"/>
     </w:p>
     <w:p/>
     <w:p>
@@ -9488,11 +11309,11 @@
       <w:pPr>
         <w:pStyle w:val="Heading3"/>
       </w:pPr>
-      <w:bookmarkStart w:id="26" w:name="_Toc203364738"/>
+      <w:bookmarkStart w:id="36" w:name="_Toc203870379"/>
       <w:r>
         <w:t>Basic Conceptual Questions</w:t>
       </w:r>
-      <w:bookmarkEnd w:id="26"/>
+      <w:bookmarkEnd w:id="36"/>
     </w:p>
     <w:p>
       <w:pPr>
@@ -9792,11 +11613,11 @@
       <w:pPr>
         <w:pStyle w:val="Heading3"/>
       </w:pPr>
-      <w:bookmarkStart w:id="27" w:name="_Toc203364739"/>
+      <w:bookmarkStart w:id="37" w:name="_Toc203870380"/>
       <w:r>
         <w:t>Syntax and Usage</w:t>
       </w:r>
-      <w:bookmarkEnd w:id="27"/>
+      <w:bookmarkEnd w:id="37"/>
     </w:p>
     <w:p>
       <w:pPr>
@@ -10012,7 +11833,7 @@
       <w:pPr>
         <w:pStyle w:val="Heading3"/>
       </w:pPr>
-      <w:bookmarkStart w:id="28" w:name="_Toc203364740"/>
+      <w:bookmarkStart w:id="38" w:name="_Toc203870381"/>
       <w:r>
         <w:t xml:space="preserve">Object </w:t>
       </w:r>
@@ -10024,7 +11845,7 @@
       <w:r>
         <w:t xml:space="preserve"> &amp; Life Cycle</w:t>
       </w:r>
-      <w:bookmarkEnd w:id="28"/>
+      <w:bookmarkEnd w:id="38"/>
     </w:p>
     <w:p>
       <w:pPr>
@@ -10240,11 +12061,11 @@
       <w:pPr>
         <w:pStyle w:val="Heading3"/>
       </w:pPr>
-      <w:bookmarkStart w:id="29" w:name="_Toc203364741"/>
+      <w:bookmarkStart w:id="39" w:name="_Toc203870382"/>
       <w:r>
         <w:t>Code-based / Practical Questions</w:t>
       </w:r>
-      <w:bookmarkEnd w:id="29"/>
+      <w:bookmarkEnd w:id="39"/>
     </w:p>
     <w:p>
       <w:pPr>
@@ -10460,12 +12281,12 @@
       <w:pPr>
         <w:pStyle w:val="Heading3"/>
       </w:pPr>
-      <w:bookmarkStart w:id="30" w:name="_Toc203364742"/>
+      <w:bookmarkStart w:id="40" w:name="_Toc203870383"/>
       <w:r>
         <w:lastRenderedPageBreak/>
         <w:t>Advanced Object Usage</w:t>
       </w:r>
-      <w:bookmarkEnd w:id="30"/>
+      <w:bookmarkEnd w:id="40"/>
     </w:p>
     <w:p>
       <w:pPr>
@@ -10708,12 +12529,12 @@
       <w:pPr>
         <w:pStyle w:val="Heading3"/>
       </w:pPr>
-      <w:bookmarkStart w:id="31" w:name="_Toc203364743"/>
+      <w:bookmarkStart w:id="41" w:name="_Toc203870384"/>
       <w:r>
         <w:lastRenderedPageBreak/>
         <w:t>Other Questions</w:t>
       </w:r>
-      <w:bookmarkEnd w:id="31"/>
+      <w:bookmarkEnd w:id="41"/>
     </w:p>
     <w:p>
       <w:pPr>
@@ -12565,6 +14386,118 @@
     </w:lvl>
   </w:abstractNum>
   <w:abstractNum w:abstractNumId="7">
+    <w:nsid w:val="1A6A7E33"/>
+    <w:multiLevelType w:val="hybridMultilevel"/>
+    <w:tmpl w:val="973C561C"/>
+    <w:lvl w:ilvl="0" w:tplc="1504995A">
+      <w:numFmt w:val="bullet"/>
+      <w:lvlText w:val="-"/>
+      <w:lvlJc w:val="left"/>
+      <w:pPr>
+        <w:ind w:left="720" w:hanging="360"/>
+      </w:pPr>
+      <w:rPr>
+        <w:rFonts w:ascii="Calibri" w:eastAsiaTheme="minorHAnsi" w:hAnsi="Calibri" w:cstheme="minorBidi" w:hint="default"/>
+      </w:rPr>
+    </w:lvl>
+    <w:lvl w:ilvl="1" w:tplc="08090003" w:tentative="1">
+      <w:start w:val="1"/>
+      <w:numFmt w:val="bullet"/>
+      <w:lvlText w:val="o"/>
+      <w:lvlJc w:val="left"/>
+      <w:pPr>
+        <w:ind w:left="1440" w:hanging="360"/>
+      </w:pPr>
+      <w:rPr>
+        <w:rFonts w:ascii="Courier New" w:hAnsi="Courier New" w:cs="Courier New" w:hint="default"/>
+      </w:rPr>
+    </w:lvl>
+    <w:lvl w:ilvl="2" w:tplc="08090005" w:tentative="1">
+      <w:start w:val="1"/>
+      <w:numFmt w:val="bullet"/>
+      <w:lvlText w:val=""/>
+      <w:lvlJc w:val="left"/>
+      <w:pPr>
+        <w:ind w:left="2160" w:hanging="360"/>
+      </w:pPr>
+      <w:rPr>
+        <w:rFonts w:ascii="Wingdings" w:hAnsi="Wingdings" w:hint="default"/>
+      </w:rPr>
+    </w:lvl>
+    <w:lvl w:ilvl="3" w:tplc="08090001" w:tentative="1">
+      <w:start w:val="1"/>
+      <w:numFmt w:val="bullet"/>
+      <w:lvlText w:val=""/>
+      <w:lvlJc w:val="left"/>
+      <w:pPr>
+        <w:ind w:left="2880" w:hanging="360"/>
+      </w:pPr>
+      <w:rPr>
+        <w:rFonts w:ascii="Symbol" w:hAnsi="Symbol" w:hint="default"/>
+      </w:rPr>
+    </w:lvl>
+    <w:lvl w:ilvl="4" w:tplc="08090003" w:tentative="1">
+      <w:start w:val="1"/>
+      <w:numFmt w:val="bullet"/>
+      <w:lvlText w:val="o"/>
+      <w:lvlJc w:val="left"/>
+      <w:pPr>
+        <w:ind w:left="3600" w:hanging="360"/>
+      </w:pPr>
+      <w:rPr>
+        <w:rFonts w:ascii="Courier New" w:hAnsi="Courier New" w:cs="Courier New" w:hint="default"/>
+      </w:rPr>
+    </w:lvl>
+    <w:lvl w:ilvl="5" w:tplc="08090005" w:tentative="1">
+      <w:start w:val="1"/>
+      <w:numFmt w:val="bullet"/>
+      <w:lvlText w:val=""/>
+      <w:lvlJc w:val="left"/>
+      <w:pPr>
+        <w:ind w:left="4320" w:hanging="360"/>
+      </w:pPr>
+      <w:rPr>
+        <w:rFonts w:ascii="Wingdings" w:hAnsi="Wingdings" w:hint="default"/>
+      </w:rPr>
+    </w:lvl>
+    <w:lvl w:ilvl="6" w:tplc="08090001" w:tentative="1">
+      <w:start w:val="1"/>
+      <w:numFmt w:val="bullet"/>
+      <w:lvlText w:val=""/>
+      <w:lvlJc w:val="left"/>
+      <w:pPr>
+        <w:ind w:left="5040" w:hanging="360"/>
+      </w:pPr>
+      <w:rPr>
+        <w:rFonts w:ascii="Symbol" w:hAnsi="Symbol" w:hint="default"/>
+      </w:rPr>
+    </w:lvl>
+    <w:lvl w:ilvl="7" w:tplc="08090003" w:tentative="1">
+      <w:start w:val="1"/>
+      <w:numFmt w:val="bullet"/>
+      <w:lvlText w:val="o"/>
+      <w:lvlJc w:val="left"/>
+      <w:pPr>
+        <w:ind w:left="5760" w:hanging="360"/>
+      </w:pPr>
+      <w:rPr>
+        <w:rFonts w:ascii="Courier New" w:hAnsi="Courier New" w:cs="Courier New" w:hint="default"/>
+      </w:rPr>
+    </w:lvl>
+    <w:lvl w:ilvl="8" w:tplc="08090005" w:tentative="1">
+      <w:start w:val="1"/>
+      <w:numFmt w:val="bullet"/>
+      <w:lvlText w:val=""/>
+      <w:lvlJc w:val="left"/>
+      <w:pPr>
+        <w:ind w:left="6480" w:hanging="360"/>
+      </w:pPr>
+      <w:rPr>
+        <w:rFonts w:ascii="Wingdings" w:hAnsi="Wingdings" w:hint="default"/>
+      </w:rPr>
+    </w:lvl>
+  </w:abstractNum>
+  <w:abstractNum w:abstractNumId="8">
     <w:nsid w:val="1B681CEC"/>
     <w:multiLevelType w:val="multilevel"/>
     <w:tmpl w:val="71EAA7F8"/>
@@ -12677,7 +14610,7 @@
       </w:pPr>
     </w:lvl>
   </w:abstractNum>
-  <w:abstractNum w:abstractNumId="8">
+  <w:abstractNum w:abstractNumId="9">
     <w:nsid w:val="1FEE3748"/>
     <w:multiLevelType w:val="multilevel"/>
     <w:tmpl w:val="26001FC6"/>
@@ -12790,7 +14723,7 @@
       </w:pPr>
     </w:lvl>
   </w:abstractNum>
-  <w:abstractNum w:abstractNumId="9">
+  <w:abstractNum w:abstractNumId="10">
     <w:nsid w:val="21631327"/>
     <w:multiLevelType w:val="multilevel"/>
     <w:tmpl w:val="92DEB18A"/>
@@ -12934,7 +14867,7 @@
       </w:rPr>
     </w:lvl>
   </w:abstractNum>
-  <w:abstractNum w:abstractNumId="10">
+  <w:abstractNum w:abstractNumId="11">
     <w:nsid w:val="28CA7D37"/>
     <w:multiLevelType w:val="hybridMultilevel"/>
     <w:tmpl w:val="9BB86494"/>
@@ -13020,7 +14953,7 @@
       </w:pPr>
     </w:lvl>
   </w:abstractNum>
-  <w:abstractNum w:abstractNumId="11">
+  <w:abstractNum w:abstractNumId="12">
     <w:nsid w:val="2B1914BC"/>
     <w:multiLevelType w:val="multilevel"/>
     <w:tmpl w:val="6136EEB8"/>
@@ -13169,7 +15102,7 @@
       </w:rPr>
     </w:lvl>
   </w:abstractNum>
-  <w:abstractNum w:abstractNumId="12">
+  <w:abstractNum w:abstractNumId="13">
     <w:nsid w:val="2E303449"/>
     <w:multiLevelType w:val="multilevel"/>
     <w:tmpl w:val="02168600"/>
@@ -13318,7 +15251,7 @@
       </w:rPr>
     </w:lvl>
   </w:abstractNum>
-  <w:abstractNum w:abstractNumId="13">
+  <w:abstractNum w:abstractNumId="14">
     <w:nsid w:val="3097505E"/>
     <w:multiLevelType w:val="multilevel"/>
     <w:tmpl w:val="B352FF7A"/>
@@ -13431,7 +15364,7 @@
       </w:pPr>
     </w:lvl>
   </w:abstractNum>
-  <w:abstractNum w:abstractNumId="14">
+  <w:abstractNum w:abstractNumId="15">
     <w:nsid w:val="32D12747"/>
     <w:multiLevelType w:val="multilevel"/>
     <w:tmpl w:val="374A71B2"/>
@@ -13580,7 +15513,7 @@
       </w:rPr>
     </w:lvl>
   </w:abstractNum>
-  <w:abstractNum w:abstractNumId="15">
+  <w:abstractNum w:abstractNumId="16">
     <w:nsid w:val="38CC3B18"/>
     <w:multiLevelType w:val="multilevel"/>
     <w:tmpl w:val="6DA8370E"/>
@@ -13729,7 +15662,7 @@
       </w:rPr>
     </w:lvl>
   </w:abstractNum>
-  <w:abstractNum w:abstractNumId="16">
+  <w:abstractNum w:abstractNumId="17">
     <w:nsid w:val="3BCD70A6"/>
     <w:multiLevelType w:val="hybridMultilevel"/>
     <w:tmpl w:val="EE4EEECC"/>
@@ -13815,7 +15748,7 @@
       </w:pPr>
     </w:lvl>
   </w:abstractNum>
-  <w:abstractNum w:abstractNumId="17">
+  <w:abstractNum w:abstractNumId="18">
     <w:nsid w:val="3DFA5EAF"/>
     <w:multiLevelType w:val="hybridMultilevel"/>
     <w:tmpl w:val="92286E46"/>
@@ -13927,7 +15860,7 @@
       </w:rPr>
     </w:lvl>
   </w:abstractNum>
-  <w:abstractNum w:abstractNumId="18">
+  <w:abstractNum w:abstractNumId="19">
     <w:nsid w:val="42EC1993"/>
     <w:multiLevelType w:val="multilevel"/>
     <w:tmpl w:val="B434C85E"/>
@@ -14076,7 +16009,7 @@
       </w:rPr>
     </w:lvl>
   </w:abstractNum>
-  <w:abstractNum w:abstractNumId="19">
+  <w:abstractNum w:abstractNumId="20">
     <w:nsid w:val="4318274E"/>
     <w:multiLevelType w:val="hybridMultilevel"/>
     <w:tmpl w:val="FD1257EE"/>
@@ -14162,7 +16095,7 @@
       </w:pPr>
     </w:lvl>
   </w:abstractNum>
-  <w:abstractNum w:abstractNumId="20">
+  <w:abstractNum w:abstractNumId="21">
     <w:nsid w:val="43EF6625"/>
     <w:multiLevelType w:val="multilevel"/>
     <w:tmpl w:val="E2A6990E"/>
@@ -14311,7 +16244,7 @@
       </w:rPr>
     </w:lvl>
   </w:abstractNum>
-  <w:abstractNum w:abstractNumId="21">
+  <w:abstractNum w:abstractNumId="22">
     <w:nsid w:val="450C114B"/>
     <w:multiLevelType w:val="multilevel"/>
     <w:tmpl w:val="3C6EB9A2"/>
@@ -14460,7 +16393,7 @@
       </w:rPr>
     </w:lvl>
   </w:abstractNum>
-  <w:abstractNum w:abstractNumId="22">
+  <w:abstractNum w:abstractNumId="23">
     <w:nsid w:val="49947562"/>
     <w:multiLevelType w:val="multilevel"/>
     <w:tmpl w:val="1AC8C140"/>
@@ -14609,7 +16542,7 @@
       </w:rPr>
     </w:lvl>
   </w:abstractNum>
-  <w:abstractNum w:abstractNumId="23">
+  <w:abstractNum w:abstractNumId="24">
     <w:nsid w:val="4AAD1C96"/>
     <w:multiLevelType w:val="hybridMultilevel"/>
     <w:tmpl w:val="AFA4D70E"/>
@@ -14695,7 +16628,7 @@
       </w:pPr>
     </w:lvl>
   </w:abstractNum>
-  <w:abstractNum w:abstractNumId="24">
+  <w:abstractNum w:abstractNumId="25">
     <w:nsid w:val="4FD557FD"/>
     <w:multiLevelType w:val="multilevel"/>
     <w:tmpl w:val="8BB05DB2"/>
@@ -14808,7 +16741,7 @@
       </w:pPr>
     </w:lvl>
   </w:abstractNum>
-  <w:abstractNum w:abstractNumId="25">
+  <w:abstractNum w:abstractNumId="26">
     <w:nsid w:val="512A0AAC"/>
     <w:multiLevelType w:val="multilevel"/>
     <w:tmpl w:val="B4AE300C"/>
@@ -14924,7 +16857,7 @@
       </w:pPr>
     </w:lvl>
   </w:abstractNum>
-  <w:abstractNum w:abstractNumId="26">
+  <w:abstractNum w:abstractNumId="27">
     <w:nsid w:val="51CA0987"/>
     <w:multiLevelType w:val="multilevel"/>
     <w:tmpl w:val="75D28358"/>
@@ -15073,7 +17006,7 @@
       </w:rPr>
     </w:lvl>
   </w:abstractNum>
-  <w:abstractNum w:abstractNumId="27">
+  <w:abstractNum w:abstractNumId="28">
     <w:nsid w:val="576209EC"/>
     <w:multiLevelType w:val="multilevel"/>
     <w:tmpl w:val="86FACD32"/>
@@ -15186,7 +17119,7 @@
       </w:pPr>
     </w:lvl>
   </w:abstractNum>
-  <w:abstractNum w:abstractNumId="28">
+  <w:abstractNum w:abstractNumId="29">
     <w:nsid w:val="586026B2"/>
     <w:multiLevelType w:val="multilevel"/>
     <w:tmpl w:val="8E94399C"/>
@@ -15299,7 +17232,7 @@
       </w:pPr>
     </w:lvl>
   </w:abstractNum>
-  <w:abstractNum w:abstractNumId="29">
+  <w:abstractNum w:abstractNumId="30">
     <w:nsid w:val="58CE27A3"/>
     <w:multiLevelType w:val="multilevel"/>
     <w:tmpl w:val="AC968050"/>
@@ -15448,7 +17381,7 @@
       </w:rPr>
     </w:lvl>
   </w:abstractNum>
-  <w:abstractNum w:abstractNumId="30">
+  <w:abstractNum w:abstractNumId="31">
     <w:nsid w:val="5FF73E9B"/>
     <w:multiLevelType w:val="hybridMultilevel"/>
     <w:tmpl w:val="53623D52"/>
@@ -15534,7 +17467,7 @@
       </w:pPr>
     </w:lvl>
   </w:abstractNum>
-  <w:abstractNum w:abstractNumId="31">
+  <w:abstractNum w:abstractNumId="32">
     <w:nsid w:val="607C3474"/>
     <w:multiLevelType w:val="multilevel"/>
     <w:tmpl w:val="04907AAE"/>
@@ -15683,7 +17616,7 @@
       </w:rPr>
     </w:lvl>
   </w:abstractNum>
-  <w:abstractNum w:abstractNumId="32">
+  <w:abstractNum w:abstractNumId="33">
     <w:nsid w:val="65413FEE"/>
     <w:multiLevelType w:val="multilevel"/>
     <w:tmpl w:val="B14893E0"/>
@@ -15796,7 +17729,7 @@
       </w:pPr>
     </w:lvl>
   </w:abstractNum>
-  <w:abstractNum w:abstractNumId="33">
+  <w:abstractNum w:abstractNumId="34">
     <w:nsid w:val="6F584A9B"/>
     <w:multiLevelType w:val="multilevel"/>
     <w:tmpl w:val="3A1CC7E0"/>
@@ -15945,7 +17878,7 @@
       </w:rPr>
     </w:lvl>
   </w:abstractNum>
-  <w:abstractNum w:abstractNumId="34">
+  <w:abstractNum w:abstractNumId="35">
     <w:nsid w:val="72696A62"/>
     <w:multiLevelType w:val="multilevel"/>
     <w:tmpl w:val="18607FC4"/>
@@ -16058,7 +17991,7 @@
       </w:pPr>
     </w:lvl>
   </w:abstractNum>
-  <w:abstractNum w:abstractNumId="35">
+  <w:abstractNum w:abstractNumId="36">
     <w:nsid w:val="73C1768E"/>
     <w:multiLevelType w:val="hybridMultilevel"/>
     <w:tmpl w:val="4C4C805E"/>
@@ -16147,7 +18080,7 @@
       </w:pPr>
     </w:lvl>
   </w:abstractNum>
-  <w:abstractNum w:abstractNumId="36">
+  <w:abstractNum w:abstractNumId="37">
     <w:nsid w:val="78C04144"/>
     <w:multiLevelType w:val="multilevel"/>
     <w:tmpl w:val="03C63F74"/>
@@ -16260,7 +18193,7 @@
       </w:pPr>
     </w:lvl>
   </w:abstractNum>
-  <w:abstractNum w:abstractNumId="37">
+  <w:abstractNum w:abstractNumId="38">
     <w:nsid w:val="7A637647"/>
     <w:multiLevelType w:val="multilevel"/>
     <w:tmpl w:val="92E2874E"/>
@@ -16410,46 +18343,46 @@
     </w:lvl>
   </w:abstractNum>
   <w:num w:numId="1">
-    <w:abstractNumId w:val="33"/>
+    <w:abstractNumId w:val="34"/>
   </w:num>
   <w:num w:numId="2">
-    <w:abstractNumId w:val="22"/>
+    <w:abstractNumId w:val="23"/>
   </w:num>
   <w:num w:numId="3">
-    <w:abstractNumId w:val="14"/>
+    <w:abstractNumId w:val="15"/>
   </w:num>
   <w:num w:numId="4">
-    <w:abstractNumId w:val="11"/>
+    <w:abstractNumId w:val="12"/>
   </w:num>
   <w:num w:numId="5">
-    <w:abstractNumId w:val="31"/>
+    <w:abstractNumId w:val="32"/>
   </w:num>
   <w:num w:numId="6">
     <w:abstractNumId w:val="1"/>
   </w:num>
   <w:num w:numId="7">
-    <w:abstractNumId w:val="37"/>
+    <w:abstractNumId w:val="38"/>
   </w:num>
   <w:num w:numId="8">
-    <w:abstractNumId w:val="9"/>
+    <w:abstractNumId w:val="10"/>
   </w:num>
   <w:num w:numId="9">
-    <w:abstractNumId w:val="21"/>
+    <w:abstractNumId w:val="22"/>
   </w:num>
   <w:num w:numId="10">
-    <w:abstractNumId w:val="18"/>
+    <w:abstractNumId w:val="19"/>
   </w:num>
   <w:num w:numId="11">
-    <w:abstractNumId w:val="15"/>
+    <w:abstractNumId w:val="16"/>
   </w:num>
   <w:num w:numId="12">
     <w:abstractNumId w:val="0"/>
   </w:num>
   <w:num w:numId="13">
-    <w:abstractNumId w:val="29"/>
+    <w:abstractNumId w:val="30"/>
   </w:num>
   <w:num w:numId="14">
-    <w:abstractNumId w:val="20"/>
+    <w:abstractNumId w:val="21"/>
   </w:num>
   <w:num w:numId="15">
     <w:abstractNumId w:val="4"/>
@@ -16458,70 +18391,73 @@
     <w:abstractNumId w:val="6"/>
   </w:num>
   <w:num w:numId="17">
-    <w:abstractNumId w:val="26"/>
+    <w:abstractNumId w:val="27"/>
   </w:num>
   <w:num w:numId="18">
-    <w:abstractNumId w:val="12"/>
+    <w:abstractNumId w:val="13"/>
   </w:num>
   <w:num w:numId="19">
     <w:abstractNumId w:val="2"/>
   </w:num>
   <w:num w:numId="20">
-    <w:abstractNumId w:val="34"/>
+    <w:abstractNumId w:val="35"/>
   </w:num>
   <w:num w:numId="21">
     <w:abstractNumId w:val="3"/>
   </w:num>
   <w:num w:numId="22">
-    <w:abstractNumId w:val="7"/>
+    <w:abstractNumId w:val="8"/>
   </w:num>
   <w:num w:numId="23">
-    <w:abstractNumId w:val="8"/>
+    <w:abstractNumId w:val="9"/>
   </w:num>
   <w:num w:numId="24">
+    <w:abstractNumId w:val="26"/>
+  </w:num>
+  <w:num w:numId="25">
+    <w:abstractNumId w:val="37"/>
+  </w:num>
+  <w:num w:numId="26">
     <w:abstractNumId w:val="25"/>
   </w:num>
-  <w:num w:numId="25">
-    <w:abstractNumId w:val="36"/>
+  <w:num w:numId="27">
+    <w:abstractNumId w:val="33"/>
   </w:num>
-  <w:num w:numId="26">
+  <w:num w:numId="28">
+    <w:abstractNumId w:val="14"/>
+  </w:num>
+  <w:num w:numId="29">
+    <w:abstractNumId w:val="28"/>
+  </w:num>
+  <w:num w:numId="30">
+    <w:abstractNumId w:val="29"/>
+  </w:num>
+  <w:num w:numId="31">
+    <w:abstractNumId w:val="20"/>
+  </w:num>
+  <w:num w:numId="32">
+    <w:abstractNumId w:val="17"/>
+  </w:num>
+  <w:num w:numId="33">
     <w:abstractNumId w:val="24"/>
   </w:num>
-  <w:num w:numId="27">
-    <w:abstractNumId w:val="32"/>
-  </w:num>
-  <w:num w:numId="28">
-    <w:abstractNumId w:val="13"/>
-  </w:num>
-  <w:num w:numId="29">
-    <w:abstractNumId w:val="27"/>
-  </w:num>
-  <w:num w:numId="30">
-    <w:abstractNumId w:val="28"/>
-  </w:num>
-  <w:num w:numId="31">
-    <w:abstractNumId w:val="19"/>
-  </w:num>
-  <w:num w:numId="32">
-    <w:abstractNumId w:val="16"/>
-  </w:num>
-  <w:num w:numId="33">
-    <w:abstractNumId w:val="23"/>
-  </w:num>
   <w:num w:numId="34">
-    <w:abstractNumId w:val="35"/>
+    <w:abstractNumId w:val="36"/>
   </w:num>
   <w:num w:numId="35">
     <w:abstractNumId w:val="5"/>
   </w:num>
   <w:num w:numId="36">
-    <w:abstractNumId w:val="10"/>
+    <w:abstractNumId w:val="11"/>
   </w:num>
   <w:num w:numId="37">
-    <w:abstractNumId w:val="17"/>
+    <w:abstractNumId w:val="18"/>
   </w:num>
   <w:num w:numId="38">
-    <w:abstractNumId w:val="30"/>
+    <w:abstractNumId w:val="31"/>
+  </w:num>
+  <w:num w:numId="39">
+    <w:abstractNumId w:val="7"/>
   </w:num>
 </w:numbering>
 </file>
@@ -17370,7 +19306,7 @@
 </file>
 
 <file path=customXml/itemProps1.xml><?xml version="1.0" encoding="utf-8"?>
-<ds:datastoreItem xmlns:ds="http://schemas.openxmlformats.org/officeDocument/2006/customXml" ds:itemID="{8046BA04-FFBF-4CB9-A223-ACCF7C8E4584}">
+<ds:datastoreItem xmlns:ds="http://schemas.openxmlformats.org/officeDocument/2006/customXml" ds:itemID="{2EE46934-E14B-4822-9045-CEF96F76FF5C}">
   <ds:schemaRefs>
     <ds:schemaRef ds:uri="http://schemas.openxmlformats.org/officeDocument/2006/bibliography"/>
   </ds:schemaRefs>

</xml_diff>